<commit_message>
docs: update report documentation
</commit_message>
<xml_diff>
--- a/backend/src/main/resources/templates/meeting-log-fyp1.docx
+++ b/backend/src/main/resources/templates/meeting-log-fyp1.docx
@@ -99,7 +99,7 @@
           </mc:Choice>
           <mc:Fallback>
             <w:pict>
-              <v:shape w14:anchorId="20C1C8E1" id="Graphic 1" o:spid="_x0000_s1026" style="position:absolute;margin-left:574.9pt;margin-top:113.65pt;width:.5pt;height:8.55pt;z-index:15728640;visibility:visible;mso-wrap-style:square;mso-wrap-distance-left:0;mso-wrap-distance-top:0;mso-wrap-distance-right:0;mso-wrap-distance-bottom:0;mso-position-horizontal:absolute;mso-position-horizontal-relative:page;mso-position-vertical:absolute;mso-position-vertical-relative:page;v-text-anchor:top" coordsize="6350,108585" o:gfxdata="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" path="m6096,l,,,6096,,108204r6096,l6096,6096,6096,xe" fillcolor="black" stroked="f">
+              <v:shape w14:anchorId="306B07F4" id="Graphic 1" o:spid="_x0000_s1026" style="position:absolute;margin-left:574.9pt;margin-top:113.65pt;width:.5pt;height:8.55pt;z-index:15728640;visibility:visible;mso-wrap-style:square;mso-wrap-distance-left:0;mso-wrap-distance-top:0;mso-wrap-distance-right:0;mso-wrap-distance-bottom:0;mso-position-horizontal:absolute;mso-position-horizontal-relative:page;mso-position-vertical:absolute;mso-position-vertical-relative:page;v-text-anchor:top" coordsize="6350,108585" o:gfxdata="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" path="m6096,l,,,6096,,108204r6096,l6096,6096,6096,xe" fillcolor="black" stroked="f">
                 <v:path arrowok="t"/>
                 <w10:wrap anchorx="page" anchory="page"/>
               </v:shape>
@@ -203,13 +203,7 @@
         <w:t xml:space="preserve"> </w:t>
       </w:r>
       <w:r>
-        <w:t xml:space="preserve">[Next </w:t>
-      </w:r>
-      <w:r>
-        <w:t>Month of start date</w:t>
-      </w:r>
-      <w:r>
-        <w:t>]</w:t>
+        <w:t>[Next Month of start date]</w:t>
       </w:r>
       <w:r>
         <w:rPr>
@@ -235,11 +229,16 @@
         </w:rPr>
         <w:t xml:space="preserve"> </w:t>
       </w:r>
+      <w:proofErr w:type="gramStart"/>
       <w:r>
         <w:t>ID:</w:t>
       </w:r>
       <w:r>
-        <w:t>[Type by student later]</w:t>
+        <w:t>[</w:t>
+      </w:r>
+      <w:proofErr w:type="gramEnd"/>
+      <w:r>
+        <w:t>Type by student later]</w:t>
       </w:r>
       <w:r>
         <w:t>)</w:t>
@@ -283,16 +282,9 @@
         <w:gridCol w:w="691"/>
         <w:gridCol w:w="271"/>
         <w:gridCol w:w="144"/>
-        <w:gridCol w:w="113"/>
-        <w:gridCol w:w="243"/>
-        <w:gridCol w:w="917"/>
-        <w:gridCol w:w="113"/>
-        <w:gridCol w:w="240"/>
-        <w:gridCol w:w="355"/>
-        <w:gridCol w:w="284"/>
-        <w:gridCol w:w="427"/>
-        <w:gridCol w:w="257"/>
-        <w:gridCol w:w="859"/>
+        <w:gridCol w:w="1273"/>
+        <w:gridCol w:w="831"/>
+        <w:gridCol w:w="1704"/>
       </w:tblGrid>
       <w:tr>
         <w:trPr>
@@ -408,80 +400,6 @@
         <w:tc>
           <w:tcPr>
             <w:tcW w:w="1688" w:type="dxa"/>
-            <w:gridSpan w:val="5"/>
-            <w:tcBorders>
-              <w:bottom w:val="single" w:sz="8" w:space="0" w:color="000000"/>
-            </w:tcBorders>
-          </w:tcPr>
-          <w:p>
-            <w:pPr>
-              <w:pStyle w:val="TableParagraph"/>
-              <w:spacing w:line="200" w:lineRule="exact"/>
-              <w:ind w:left="107"/>
-              <w:rPr>
-                <w:b/>
-                <w:sz w:val="20"/>
-              </w:rPr>
-            </w:pPr>
-            <w:r>
-              <w:rPr>
-                <w:b/>
-                <w:sz w:val="20"/>
-              </w:rPr>
-              <w:t>Meeting</w:t>
-            </w:r>
-            <w:r>
-              <w:rPr>
-                <w:b/>
-                <w:spacing w:val="-10"/>
-                <w:sz w:val="20"/>
-              </w:rPr>
-              <w:t xml:space="preserve"> </w:t>
-            </w:r>
-            <w:r>
-              <w:rPr>
-                <w:b/>
-                <w:spacing w:val="-2"/>
-                <w:sz w:val="20"/>
-              </w:rPr>
-              <w:t>Mode:</w:t>
-            </w:r>
-          </w:p>
-        </w:tc>
-        <w:tc>
-          <w:tcPr>
-            <w:tcW w:w="113" w:type="dxa"/>
-          </w:tcPr>
-          <w:p>
-            <w:pPr>
-              <w:pStyle w:val="TableParagraph"/>
-              <w:rPr>
-                <w:rFonts w:ascii="Times New Roman"/>
-                <w:sz w:val="14"/>
-              </w:rPr>
-            </w:pPr>
-          </w:p>
-        </w:tc>
-        <w:tc>
-          <w:tcPr>
-            <w:tcW w:w="240" w:type="dxa"/>
-            <w:tcBorders>
-              <w:top w:val="single" w:sz="8" w:space="0" w:color="000000"/>
-            </w:tcBorders>
-          </w:tcPr>
-          <w:p>
-            <w:pPr>
-              <w:pStyle w:val="TableParagraph"/>
-              <w:rPr>
-                <w:rFonts w:ascii="Times New Roman"/>
-                <w:sz w:val="14"/>
-              </w:rPr>
-            </w:pPr>
-          </w:p>
-        </w:tc>
-        <w:tc>
-          <w:tcPr>
-            <w:tcW w:w="1066" w:type="dxa"/>
             <w:gridSpan w:val="3"/>
             <w:tcBorders>
               <w:bottom w:val="single" w:sz="8" w:space="0" w:color="000000"/>
@@ -490,27 +408,42 @@
           <w:p>
             <w:pPr>
               <w:pStyle w:val="TableParagraph"/>
-              <w:spacing w:before="5"/>
-              <w:ind w:left="106"/>
-              <w:rPr>
-                <w:sz w:val="14"/>
-              </w:rPr>
-            </w:pPr>
-            <w:r>
-              <w:rPr>
+              <w:spacing w:line="200" w:lineRule="exact"/>
+              <w:ind w:left="107"/>
+              <w:rPr>
+                <w:b/>
+                <w:sz w:val="20"/>
+              </w:rPr>
+            </w:pPr>
+            <w:r>
+              <w:rPr>
+                <w:b/>
+                <w:sz w:val="20"/>
+              </w:rPr>
+              <w:t>Meeting</w:t>
+            </w:r>
+            <w:r>
+              <w:rPr>
+                <w:b/>
+                <w:spacing w:val="-10"/>
+                <w:sz w:val="20"/>
+              </w:rPr>
+              <w:t xml:space="preserve"> </w:t>
+            </w:r>
+            <w:r>
+              <w:rPr>
+                <w:b/>
                 <w:spacing w:val="-2"/>
-                <w:sz w:val="14"/>
-              </w:rPr>
-              <w:t>In-Person</w:t>
+                <w:sz w:val="20"/>
+              </w:rPr>
+              <w:t>Mode:</w:t>
             </w:r>
           </w:p>
         </w:tc>
         <w:tc>
           <w:tcPr>
-            <w:tcW w:w="257" w:type="dxa"/>
-            <w:tcBorders>
-              <w:top w:val="single" w:sz="8" w:space="0" w:color="000000"/>
-            </w:tcBorders>
+            <w:tcW w:w="2535" w:type="dxa"/>
+            <w:gridSpan w:val="2"/>
           </w:tcPr>
           <w:p>
             <w:pPr>
@@ -520,21 +453,20 @@
                 <w:sz w:val="14"/>
               </w:rPr>
             </w:pPr>
-          </w:p>
-        </w:tc>
-        <w:tc>
-          <w:tcPr>
-            <w:tcW w:w="859" w:type="dxa"/>
-          </w:tcPr>
-          <w:p>
-            <w:pPr>
-              <w:pStyle w:val="TableParagraph"/>
-              <w:spacing w:before="5"/>
-              <w:ind w:left="106"/>
-              <w:rPr>
-                <w:sz w:val="14"/>
-              </w:rPr>
-            </w:pPr>
+            <w:r>
+              <w:rPr>
+                <w:spacing w:val="-2"/>
+                <w:sz w:val="14"/>
+              </w:rPr>
+              <w:t xml:space="preserve">             In-Person</w:t>
+            </w:r>
+            <w:r>
+              <w:rPr>
+                <w:rFonts w:ascii="Times New Roman"/>
+                <w:sz w:val="14"/>
+              </w:rPr>
+              <w:t xml:space="preserve">                      </w:t>
+            </w:r>
             <w:r>
               <w:rPr>
                 <w:spacing w:val="-2"/>
@@ -645,92 +577,59 @@
         </w:tc>
         <w:tc>
           <w:tcPr>
-            <w:tcW w:w="113" w:type="dxa"/>
+            <w:tcW w:w="2104" w:type="dxa"/>
+            <w:gridSpan w:val="2"/>
+            <w:tcBorders>
+              <w:right w:val="single" w:sz="4" w:space="0" w:color="auto"/>
+            </w:tcBorders>
           </w:tcPr>
           <w:p>
             <w:pPr>
               <w:pStyle w:val="TableParagraph"/>
-              <w:rPr>
-                <w:rFonts w:ascii="Times New Roman"/>
-                <w:sz w:val="14"/>
-              </w:rPr>
-            </w:pPr>
+              <w:spacing w:before="5"/>
+              <w:ind w:left="106"/>
+              <w:rPr>
+                <w:sz w:val="14"/>
+              </w:rPr>
+            </w:pPr>
+            <w:r>
+              <w:rPr>
+                <w:sz w:val="14"/>
+              </w:rPr>
+              <w:t xml:space="preserve">            </w:t>
+            </w:r>
+            <w:r>
+              <w:rPr>
+                <w:sz w:val="14"/>
+              </w:rPr>
+              <w:t xml:space="preserve">  </w:t>
+            </w:r>
+            <w:r>
+              <w:rPr>
+                <w:sz w:val="14"/>
+              </w:rPr>
+              <w:t>Research-based</w:t>
+            </w:r>
           </w:p>
         </w:tc>
         <w:tc>
           <w:tcPr>
-            <w:tcW w:w="243" w:type="dxa"/>
+            <w:tcW w:w="1704" w:type="dxa"/>
             <w:tcBorders>
-              <w:top w:val="single" w:sz="8" w:space="0" w:color="000000"/>
+              <w:left w:val="single" w:sz="4" w:space="0" w:color="auto"/>
             </w:tcBorders>
           </w:tcPr>
           <w:p>
             <w:pPr>
               <w:pStyle w:val="TableParagraph"/>
-              <w:rPr>
-                <w:rFonts w:ascii="Times New Roman"/>
-                <w:sz w:val="14"/>
-              </w:rPr>
-            </w:pPr>
-          </w:p>
-        </w:tc>
-        <w:tc>
-          <w:tcPr>
-            <w:tcW w:w="1625" w:type="dxa"/>
-            <w:gridSpan w:val="4"/>
-          </w:tcPr>
-          <w:p>
-            <w:pPr>
-              <w:pStyle w:val="TableParagraph"/>
               <w:spacing w:before="5"/>
-              <w:ind w:left="106"/>
-              <w:rPr>
-                <w:sz w:val="14"/>
-              </w:rPr>
-            </w:pPr>
-            <w:r>
-              <w:rPr>
-                <w:spacing w:val="-2"/>
-                <w:sz w:val="14"/>
-              </w:rPr>
-              <w:t>Research-based</w:t>
-            </w:r>
-          </w:p>
-        </w:tc>
-        <w:tc>
-          <w:tcPr>
-            <w:tcW w:w="284" w:type="dxa"/>
-            <w:tcBorders>
-              <w:top w:val="single" w:sz="8" w:space="0" w:color="000000"/>
-            </w:tcBorders>
-          </w:tcPr>
-          <w:p>
-            <w:pPr>
-              <w:pStyle w:val="TableParagraph"/>
-              <w:rPr>
-                <w:rFonts w:ascii="Times New Roman"/>
-                <w:sz w:val="14"/>
-              </w:rPr>
-            </w:pPr>
-          </w:p>
-        </w:tc>
-        <w:tc>
-          <w:tcPr>
-            <w:tcW w:w="1543" w:type="dxa"/>
-            <w:gridSpan w:val="3"/>
-          </w:tcPr>
-          <w:p>
-            <w:pPr>
-              <w:pStyle w:val="TableParagraph"/>
-              <w:spacing w:before="5"/>
-              <w:ind w:left="106"/>
-              <w:rPr>
-                <w:sz w:val="14"/>
-              </w:rPr>
-            </w:pPr>
-            <w:r>
-              <w:rPr>
-                <w:spacing w:val="-2"/>
+              <w:ind w:left="473"/>
+              <w:rPr>
+                <w:sz w:val="14"/>
+              </w:rPr>
+            </w:pPr>
+            <w:r>
+              <w:rPr>
                 <w:sz w:val="14"/>
               </w:rPr>
               <w:t>Application-based</w:t>
@@ -784,7 +683,7 @@
         <w:tc>
           <w:tcPr>
             <w:tcW w:w="7469" w:type="dxa"/>
-            <w:gridSpan w:val="18"/>
+            <w:gridSpan w:val="11"/>
           </w:tcPr>
           <w:p>
             <w:pPr>
@@ -898,7 +797,7 @@
         <w:tc>
           <w:tcPr>
             <w:tcW w:w="3952" w:type="dxa"/>
-            <w:gridSpan w:val="11"/>
+            <w:gridSpan w:val="4"/>
           </w:tcPr>
           <w:p>
             <w:pPr>
@@ -945,19 +844,44 @@
               </w:rPr>
               <w:t xml:space="preserve"> </w:t>
             </w:r>
-            <w:r>
-              <w:rPr>
-                <w:b/>
-                <w:sz w:val="20"/>
-              </w:rPr>
-              <w:t>Programme and Specialisation:</w:t>
+            <w:proofErr w:type="spellStart"/>
+            <w:r>
+              <w:rPr>
+                <w:b/>
+                <w:sz w:val="20"/>
+              </w:rPr>
+              <w:t>Programme</w:t>
+            </w:r>
+            <w:proofErr w:type="spellEnd"/>
+            <w:r>
+              <w:rPr>
+                <w:b/>
+                <w:sz w:val="20"/>
+              </w:rPr>
+              <w:t xml:space="preserve"> and </w:t>
+            </w:r>
+            <w:proofErr w:type="spellStart"/>
+            <w:r>
+              <w:rPr>
+                <w:b/>
+                <w:sz w:val="20"/>
+              </w:rPr>
+              <w:t>Specialisation</w:t>
+            </w:r>
+            <w:proofErr w:type="spellEnd"/>
+            <w:r>
+              <w:rPr>
+                <w:b/>
+                <w:sz w:val="20"/>
+              </w:rPr>
+              <w:t>:</w:t>
             </w:r>
           </w:p>
         </w:tc>
         <w:tc>
           <w:tcPr>
             <w:tcW w:w="5197" w:type="dxa"/>
-            <w:gridSpan w:val="14"/>
+            <w:gridSpan w:val="7"/>
           </w:tcPr>
           <w:p>
             <w:pPr>
@@ -1027,7 +951,7 @@
         <w:tc>
           <w:tcPr>
             <w:tcW w:w="5197" w:type="dxa"/>
-            <w:gridSpan w:val="14"/>
+            <w:gridSpan w:val="7"/>
           </w:tcPr>
           <w:p>
             <w:pPr>
@@ -1117,7 +1041,7 @@
         <w:tc>
           <w:tcPr>
             <w:tcW w:w="5197" w:type="dxa"/>
-            <w:gridSpan w:val="14"/>
+            <w:gridSpan w:val="7"/>
           </w:tcPr>
           <w:p>
             <w:pPr>
@@ -1207,7 +1131,7 @@
         <w:tc>
           <w:tcPr>
             <w:tcW w:w="5197" w:type="dxa"/>
-            <w:gridSpan w:val="14"/>
+            <w:gridSpan w:val="7"/>
           </w:tcPr>
           <w:p>
             <w:pPr>
@@ -1315,7 +1239,7 @@
         <w:tc>
           <w:tcPr>
             <w:tcW w:w="5197" w:type="dxa"/>
-            <w:gridSpan w:val="14"/>
+            <w:gridSpan w:val="7"/>
           </w:tcPr>
           <w:p>
             <w:pPr>
@@ -1358,12 +1282,7 @@
         <w:tblLook w:val="01E0" w:firstRow="1" w:lastRow="1" w:firstColumn="1" w:lastColumn="1" w:noHBand="0" w:noVBand="0"/>
       </w:tblPr>
       <w:tblGrid>
-        <w:gridCol w:w="113"/>
-        <w:gridCol w:w="238"/>
-        <w:gridCol w:w="1772"/>
-        <w:gridCol w:w="273"/>
-        <w:gridCol w:w="3525"/>
-        <w:gridCol w:w="3105"/>
+        <w:gridCol w:w="9026"/>
       </w:tblGrid>
       <w:tr>
         <w:trPr>
@@ -1372,7 +1291,6 @@
         <w:tc>
           <w:tcPr>
             <w:tcW w:w="9026" w:type="dxa"/>
-            <w:gridSpan w:val="6"/>
           </w:tcPr>
           <w:p>
             <w:pPr>
@@ -1425,574 +1343,6 @@
                 <w:sz w:val="16"/>
               </w:rPr>
             </w:pPr>
-            <w:r>
-              <w:rPr>
-                <w:b/>
-                <w:noProof/>
-                <w:sz w:val="16"/>
-              </w:rPr>
-              <mc:AlternateContent>
-                <mc:Choice Requires="wpg">
-                  <w:drawing>
-                    <wp:anchor distT="0" distB="0" distL="0" distR="0" simplePos="0" relativeHeight="251637248" behindDoc="1" locked="0" layoutInCell="1" allowOverlap="1" wp14:anchorId="194EB812" wp14:editId="5DFE2FD6">
-                      <wp:simplePos x="0" y="0"/>
-                      <wp:positionH relativeFrom="column">
-                        <wp:posOffset>70154</wp:posOffset>
-                      </wp:positionH>
-                      <wp:positionV relativeFrom="paragraph">
-                        <wp:posOffset>115818</wp:posOffset>
-                      </wp:positionV>
-                      <wp:extent cx="219710" cy="109291"/>
-                      <wp:effectExtent l="0" t="0" r="8890" b="5080"/>
-                      <wp:wrapNone/>
-                      <wp:docPr id="5" name="Group 5"/>
-                      <wp:cNvGraphicFramePr>
-                        <a:graphicFrameLocks xmlns:a="http://schemas.openxmlformats.org/drawingml/2006/main"/>
-                      </wp:cNvGraphicFramePr>
-                      <a:graphic xmlns:a="http://schemas.openxmlformats.org/drawingml/2006/main">
-                        <a:graphicData uri="http://schemas.microsoft.com/office/word/2010/wordprocessingGroup">
-                          <wpg:wgp>
-                            <wpg:cNvGrpSpPr>
-                              <a:grpSpLocks/>
-                            </wpg:cNvGrpSpPr>
-                            <wpg:grpSpPr>
-                              <a:xfrm>
-                                <a:off x="0" y="0"/>
-                                <a:ext cx="219710" cy="109291"/>
-                                <a:chOff x="0" y="0"/>
-                                <a:chExt cx="219710" cy="222885"/>
-                              </a:xfrm>
-                            </wpg:grpSpPr>
-                            <wps:wsp>
-                              <wps:cNvPr id="6" name="Graphic 6"/>
-                              <wps:cNvSpPr/>
-                              <wps:spPr>
-                                <a:xfrm>
-                                  <a:off x="0" y="0"/>
-                                  <a:ext cx="219710" cy="222885"/>
-                                </a:xfrm>
-                                <a:custGeom>
-                                  <a:avLst/>
-                                  <a:gdLst/>
-                                  <a:ahLst/>
-                                  <a:cxnLst/>
-                                  <a:rect l="l" t="t" r="r" b="b"/>
-                                  <a:pathLst>
-                                    <a:path w="219710" h="222885">
-                                      <a:moveTo>
-                                        <a:pt x="219456" y="6108"/>
-                                      </a:moveTo>
-                                      <a:lnTo>
-                                        <a:pt x="213360" y="6108"/>
-                                      </a:lnTo>
-                                      <a:lnTo>
-                                        <a:pt x="213360" y="108204"/>
-                                      </a:lnTo>
-                                      <a:lnTo>
-                                        <a:pt x="213360" y="114300"/>
-                                      </a:lnTo>
-                                      <a:lnTo>
-                                        <a:pt x="213360" y="216408"/>
-                                      </a:lnTo>
-                                      <a:lnTo>
-                                        <a:pt x="6096" y="216408"/>
-                                      </a:lnTo>
-                                      <a:lnTo>
-                                        <a:pt x="6096" y="114300"/>
-                                      </a:lnTo>
-                                      <a:lnTo>
-                                        <a:pt x="6096" y="108204"/>
-                                      </a:lnTo>
-                                      <a:lnTo>
-                                        <a:pt x="6096" y="6108"/>
-                                      </a:lnTo>
-                                      <a:lnTo>
-                                        <a:pt x="0" y="6108"/>
-                                      </a:lnTo>
-                                      <a:lnTo>
-                                        <a:pt x="0" y="108204"/>
-                                      </a:lnTo>
-                                      <a:lnTo>
-                                        <a:pt x="0" y="114300"/>
-                                      </a:lnTo>
-                                      <a:lnTo>
-                                        <a:pt x="0" y="216408"/>
-                                      </a:lnTo>
-                                      <a:lnTo>
-                                        <a:pt x="0" y="222504"/>
-                                      </a:lnTo>
-                                      <a:lnTo>
-                                        <a:pt x="6096" y="222504"/>
-                                      </a:lnTo>
-                                      <a:lnTo>
-                                        <a:pt x="213360" y="222504"/>
-                                      </a:lnTo>
-                                      <a:lnTo>
-                                        <a:pt x="219456" y="222504"/>
-                                      </a:lnTo>
-                                      <a:lnTo>
-                                        <a:pt x="219456" y="216408"/>
-                                      </a:lnTo>
-                                      <a:lnTo>
-                                        <a:pt x="219456" y="114300"/>
-                                      </a:lnTo>
-                                      <a:lnTo>
-                                        <a:pt x="219456" y="108204"/>
-                                      </a:lnTo>
-                                      <a:lnTo>
-                                        <a:pt x="219456" y="6108"/>
-                                      </a:lnTo>
-                                      <a:close/>
-                                    </a:path>
-                                    <a:path w="219710" h="222885">
-                                      <a:moveTo>
-                                        <a:pt x="219456" y="0"/>
-                                      </a:moveTo>
-                                      <a:lnTo>
-                                        <a:pt x="213360" y="0"/>
-                                      </a:lnTo>
-                                      <a:lnTo>
-                                        <a:pt x="6096" y="0"/>
-                                      </a:lnTo>
-                                      <a:lnTo>
-                                        <a:pt x="0" y="0"/>
-                                      </a:lnTo>
-                                      <a:lnTo>
-                                        <a:pt x="0" y="6096"/>
-                                      </a:lnTo>
-                                      <a:lnTo>
-                                        <a:pt x="6096" y="6096"/>
-                                      </a:lnTo>
-                                      <a:lnTo>
-                                        <a:pt x="213360" y="6096"/>
-                                      </a:lnTo>
-                                      <a:lnTo>
-                                        <a:pt x="219456" y="6096"/>
-                                      </a:lnTo>
-                                      <a:lnTo>
-                                        <a:pt x="219456" y="0"/>
-                                      </a:lnTo>
-                                      <a:close/>
-                                    </a:path>
-                                  </a:pathLst>
-                                </a:custGeom>
-                                <a:solidFill>
-                                  <a:srgbClr val="000000"/>
-                                </a:solidFill>
-                              </wps:spPr>
-                              <wps:bodyPr wrap="square" lIns="0" tIns="0" rIns="0" bIns="0" rtlCol="0">
-                                <a:prstTxWarp prst="textNoShape">
-                                  <a:avLst/>
-                                </a:prstTxWarp>
-                                <a:noAutofit/>
-                              </wps:bodyPr>
-                            </wps:wsp>
-                          </wpg:wgp>
-                        </a:graphicData>
-                      </a:graphic>
-                      <wp14:sizeRelV relativeFrom="margin">
-                        <wp14:pctHeight>0</wp14:pctHeight>
-                      </wp14:sizeRelV>
-                    </wp:anchor>
-                  </w:drawing>
-                </mc:Choice>
-                <mc:Fallback>
-                  <w:pict>
-                    <v:group w14:anchorId="17594C15" id="Group 5" o:spid="_x0000_s1026" style="position:absolute;margin-left:5.5pt;margin-top:9.1pt;width:17.3pt;height:8.6pt;z-index:-251679232;mso-wrap-distance-left:0;mso-wrap-distance-right:0;mso-height-relative:margin" coordsize="219710,222885" o:gfxdata="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">
-                      <v:shape id="Graphic 6" o:spid="_x0000_s1027" style="position:absolute;width:219710;height:222885;visibility:visible;mso-wrap-style:square;v-text-anchor:top" coordsize="219710,222885" o:gfxdata="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" path="m219456,6108r-6096,l213360,108204r,6096l213360,216408r-207264,l6096,114300r,-6096l6096,6108,,6108,,108204r,6096l,216408r,6096l6096,222504r207264,l219456,222504r,-6096l219456,114300r,-6096l219456,6108xem219456,r-6096,l6096,,,,,6096r6096,l213360,6096r6096,l219456,xe" fillcolor="black" stroked="f">
-                        <v:path arrowok="t"/>
-                      </v:shape>
-                    </v:group>
-                  </w:pict>
-                </mc:Fallback>
-              </mc:AlternateContent>
-            </w:r>
-            <w:r>
-              <w:rPr>
-                <w:noProof/>
-                <w:sz w:val="14"/>
-              </w:rPr>
-              <mc:AlternateContent>
-                <mc:Choice Requires="wpg">
-                  <w:drawing>
-                    <wp:anchor distT="0" distB="0" distL="0" distR="0" simplePos="0" relativeHeight="251652608" behindDoc="1" locked="0" layoutInCell="1" allowOverlap="1" wp14:anchorId="7D53326A" wp14:editId="33BB3E5D">
-                      <wp:simplePos x="0" y="0"/>
-                      <wp:positionH relativeFrom="column">
-                        <wp:posOffset>1968171</wp:posOffset>
-                      </wp:positionH>
-                      <wp:positionV relativeFrom="paragraph">
-                        <wp:posOffset>119461</wp:posOffset>
-                      </wp:positionV>
-                      <wp:extent cx="204470" cy="123863"/>
-                      <wp:effectExtent l="0" t="0" r="5080" b="9525"/>
-                      <wp:wrapNone/>
-                      <wp:docPr id="7" name="Group 7"/>
-                      <wp:cNvGraphicFramePr>
-                        <a:graphicFrameLocks xmlns:a="http://schemas.openxmlformats.org/drawingml/2006/main"/>
-                      </wp:cNvGraphicFramePr>
-                      <a:graphic xmlns:a="http://schemas.openxmlformats.org/drawingml/2006/main">
-                        <a:graphicData uri="http://schemas.microsoft.com/office/word/2010/wordprocessingGroup">
-                          <wpg:wgp>
-                            <wpg:cNvGrpSpPr>
-                              <a:grpSpLocks/>
-                            </wpg:cNvGrpSpPr>
-                            <wpg:grpSpPr>
-                              <a:xfrm>
-                                <a:off x="0" y="0"/>
-                                <a:ext cx="204470" cy="123863"/>
-                                <a:chOff x="0" y="0"/>
-                                <a:chExt cx="204470" cy="222885"/>
-                              </a:xfrm>
-                            </wpg:grpSpPr>
-                            <wps:wsp>
-                              <wps:cNvPr id="8" name="Graphic 8"/>
-                              <wps:cNvSpPr/>
-                              <wps:spPr>
-                                <a:xfrm>
-                                  <a:off x="0" y="0"/>
-                                  <a:ext cx="204470" cy="222885"/>
-                                </a:xfrm>
-                                <a:custGeom>
-                                  <a:avLst/>
-                                  <a:gdLst/>
-                                  <a:ahLst/>
-                                  <a:cxnLst/>
-                                  <a:rect l="l" t="t" r="r" b="b"/>
-                                  <a:pathLst>
-                                    <a:path w="204470" h="222885">
-                                      <a:moveTo>
-                                        <a:pt x="204216" y="6108"/>
-                                      </a:moveTo>
-                                      <a:lnTo>
-                                        <a:pt x="198120" y="6108"/>
-                                      </a:lnTo>
-                                      <a:lnTo>
-                                        <a:pt x="198120" y="108204"/>
-                                      </a:lnTo>
-                                      <a:lnTo>
-                                        <a:pt x="198120" y="114300"/>
-                                      </a:lnTo>
-                                      <a:lnTo>
-                                        <a:pt x="198120" y="216408"/>
-                                      </a:lnTo>
-                                      <a:lnTo>
-                                        <a:pt x="6096" y="216408"/>
-                                      </a:lnTo>
-                                      <a:lnTo>
-                                        <a:pt x="6096" y="114300"/>
-                                      </a:lnTo>
-                                      <a:lnTo>
-                                        <a:pt x="6096" y="108204"/>
-                                      </a:lnTo>
-                                      <a:lnTo>
-                                        <a:pt x="6096" y="6108"/>
-                                      </a:lnTo>
-                                      <a:lnTo>
-                                        <a:pt x="0" y="6108"/>
-                                      </a:lnTo>
-                                      <a:lnTo>
-                                        <a:pt x="0" y="108204"/>
-                                      </a:lnTo>
-                                      <a:lnTo>
-                                        <a:pt x="0" y="114300"/>
-                                      </a:lnTo>
-                                      <a:lnTo>
-                                        <a:pt x="0" y="216408"/>
-                                      </a:lnTo>
-                                      <a:lnTo>
-                                        <a:pt x="0" y="222504"/>
-                                      </a:lnTo>
-                                      <a:lnTo>
-                                        <a:pt x="6096" y="222504"/>
-                                      </a:lnTo>
-                                      <a:lnTo>
-                                        <a:pt x="198120" y="222504"/>
-                                      </a:lnTo>
-                                      <a:lnTo>
-                                        <a:pt x="204216" y="222504"/>
-                                      </a:lnTo>
-                                      <a:lnTo>
-                                        <a:pt x="204216" y="216408"/>
-                                      </a:lnTo>
-                                      <a:lnTo>
-                                        <a:pt x="204216" y="114300"/>
-                                      </a:lnTo>
-                                      <a:lnTo>
-                                        <a:pt x="204216" y="108204"/>
-                                      </a:lnTo>
-                                      <a:lnTo>
-                                        <a:pt x="204216" y="6108"/>
-                                      </a:lnTo>
-                                      <a:close/>
-                                    </a:path>
-                                    <a:path w="204470" h="222885">
-                                      <a:moveTo>
-                                        <a:pt x="204216" y="0"/>
-                                      </a:moveTo>
-                                      <a:lnTo>
-                                        <a:pt x="198120" y="0"/>
-                                      </a:lnTo>
-                                      <a:lnTo>
-                                        <a:pt x="6096" y="0"/>
-                                      </a:lnTo>
-                                      <a:lnTo>
-                                        <a:pt x="0" y="0"/>
-                                      </a:lnTo>
-                                      <a:lnTo>
-                                        <a:pt x="0" y="6096"/>
-                                      </a:lnTo>
-                                      <a:lnTo>
-                                        <a:pt x="6096" y="6096"/>
-                                      </a:lnTo>
-                                      <a:lnTo>
-                                        <a:pt x="198120" y="6096"/>
-                                      </a:lnTo>
-                                      <a:lnTo>
-                                        <a:pt x="204216" y="6096"/>
-                                      </a:lnTo>
-                                      <a:lnTo>
-                                        <a:pt x="204216" y="0"/>
-                                      </a:lnTo>
-                                      <a:close/>
-                                    </a:path>
-                                  </a:pathLst>
-                                </a:custGeom>
-                                <a:solidFill>
-                                  <a:srgbClr val="000000"/>
-                                </a:solidFill>
-                              </wps:spPr>
-                              <wps:bodyPr wrap="square" lIns="0" tIns="0" rIns="0" bIns="0" rtlCol="0">
-                                <a:prstTxWarp prst="textNoShape">
-                                  <a:avLst/>
-                                </a:prstTxWarp>
-                                <a:noAutofit/>
-                              </wps:bodyPr>
-                            </wps:wsp>
-                          </wpg:wgp>
-                        </a:graphicData>
-                      </a:graphic>
-                      <wp14:sizeRelV relativeFrom="margin">
-                        <wp14:pctHeight>0</wp14:pctHeight>
-                      </wp14:sizeRelV>
-                    </wp:anchor>
-                  </w:drawing>
-                </mc:Choice>
-                <mc:Fallback>
-                  <w:pict>
-                    <v:group w14:anchorId="0154B3B4" id="Group 7" o:spid="_x0000_s1026" style="position:absolute;margin-left:154.95pt;margin-top:9.4pt;width:16.1pt;height:9.75pt;z-index:-251663872;mso-wrap-distance-left:0;mso-wrap-distance-right:0;mso-height-relative:margin" coordsize="204470,222885" o:gfxdata="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">
-                      <v:shape id="Graphic 8" o:spid="_x0000_s1027" style="position:absolute;width:204470;height:222885;visibility:visible;mso-wrap-style:square;v-text-anchor:top" coordsize="204470,222885" o:gfxdata="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" path="m204216,6108r-6096,l198120,108204r,6096l198120,216408r-192024,l6096,114300r,-6096l6096,6108,,6108,,108204r,6096l,216408r,6096l6096,222504r192024,l204216,222504r,-6096l204216,114300r,-6096l204216,6108xem204216,r-6096,l6096,,,,,6096r6096,l198120,6096r6096,l204216,xe" fillcolor="black" stroked="f">
-                        <v:path arrowok="t"/>
-                      </v:shape>
-                    </v:group>
-                  </w:pict>
-                </mc:Fallback>
-              </mc:AlternateContent>
-            </w:r>
-            <w:r>
-              <w:rPr>
-                <w:noProof/>
-                <w:sz w:val="14"/>
-              </w:rPr>
-              <mc:AlternateContent>
-                <mc:Choice Requires="wpg">
-                  <w:drawing>
-                    <wp:anchor distT="0" distB="0" distL="0" distR="0" simplePos="0" relativeHeight="251665920" behindDoc="1" locked="0" layoutInCell="1" allowOverlap="1" wp14:anchorId="5ECA6FB9" wp14:editId="19BE7838">
-                      <wp:simplePos x="0" y="0"/>
-                      <wp:positionH relativeFrom="column">
-                        <wp:posOffset>3412259</wp:posOffset>
-                      </wp:positionH>
-                      <wp:positionV relativeFrom="paragraph">
-                        <wp:posOffset>117764</wp:posOffset>
-                      </wp:positionV>
-                      <wp:extent cx="231775" cy="135081"/>
-                      <wp:effectExtent l="0" t="0" r="0" b="0"/>
-                      <wp:wrapNone/>
-                      <wp:docPr id="9" name="Group 9"/>
-                      <wp:cNvGraphicFramePr>
-                        <a:graphicFrameLocks xmlns:a="http://schemas.openxmlformats.org/drawingml/2006/main"/>
-                      </wp:cNvGraphicFramePr>
-                      <a:graphic xmlns:a="http://schemas.openxmlformats.org/drawingml/2006/main">
-                        <a:graphicData uri="http://schemas.microsoft.com/office/word/2010/wordprocessingGroup">
-                          <wpg:wgp>
-                            <wpg:cNvGrpSpPr>
-                              <a:grpSpLocks/>
-                            </wpg:cNvGrpSpPr>
-                            <wpg:grpSpPr>
-                              <a:xfrm>
-                                <a:off x="0" y="0"/>
-                                <a:ext cx="231775" cy="135081"/>
-                                <a:chOff x="0" y="0"/>
-                                <a:chExt cx="231775" cy="222885"/>
-                              </a:xfrm>
-                            </wpg:grpSpPr>
-                            <wps:wsp>
-                              <wps:cNvPr id="10" name="Graphic 10"/>
-                              <wps:cNvSpPr/>
-                              <wps:spPr>
-                                <a:xfrm>
-                                  <a:off x="0" y="0"/>
-                                  <a:ext cx="231775" cy="222885"/>
-                                </a:xfrm>
-                                <a:custGeom>
-                                  <a:avLst/>
-                                  <a:gdLst/>
-                                  <a:ahLst/>
-                                  <a:cxnLst/>
-                                  <a:rect l="l" t="t" r="r" b="b"/>
-                                  <a:pathLst>
-                                    <a:path w="231775" h="222885">
-                                      <a:moveTo>
-                                        <a:pt x="6083" y="6108"/>
-                                      </a:moveTo>
-                                      <a:lnTo>
-                                        <a:pt x="0" y="6108"/>
-                                      </a:lnTo>
-                                      <a:lnTo>
-                                        <a:pt x="0" y="108204"/>
-                                      </a:lnTo>
-                                      <a:lnTo>
-                                        <a:pt x="0" y="114300"/>
-                                      </a:lnTo>
-                                      <a:lnTo>
-                                        <a:pt x="0" y="216408"/>
-                                      </a:lnTo>
-                                      <a:lnTo>
-                                        <a:pt x="0" y="222504"/>
-                                      </a:lnTo>
-                                      <a:lnTo>
-                                        <a:pt x="6083" y="222504"/>
-                                      </a:lnTo>
-                                      <a:lnTo>
-                                        <a:pt x="6083" y="216408"/>
-                                      </a:lnTo>
-                                      <a:lnTo>
-                                        <a:pt x="6083" y="114300"/>
-                                      </a:lnTo>
-                                      <a:lnTo>
-                                        <a:pt x="6083" y="108204"/>
-                                      </a:lnTo>
-                                      <a:lnTo>
-                                        <a:pt x="6083" y="6108"/>
-                                      </a:lnTo>
-                                      <a:close/>
-                                    </a:path>
-                                    <a:path w="231775" h="222885">
-                                      <a:moveTo>
-                                        <a:pt x="6083" y="0"/>
-                                      </a:moveTo>
-                                      <a:lnTo>
-                                        <a:pt x="0" y="0"/>
-                                      </a:lnTo>
-                                      <a:lnTo>
-                                        <a:pt x="0" y="6096"/>
-                                      </a:lnTo>
-                                      <a:lnTo>
-                                        <a:pt x="6083" y="6096"/>
-                                      </a:lnTo>
-                                      <a:lnTo>
-                                        <a:pt x="6083" y="0"/>
-                                      </a:lnTo>
-                                      <a:close/>
-                                    </a:path>
-                                    <a:path w="231775" h="222885">
-                                      <a:moveTo>
-                                        <a:pt x="231648" y="6108"/>
-                                      </a:moveTo>
-                                      <a:lnTo>
-                                        <a:pt x="225552" y="6108"/>
-                                      </a:lnTo>
-                                      <a:lnTo>
-                                        <a:pt x="225552" y="108204"/>
-                                      </a:lnTo>
-                                      <a:lnTo>
-                                        <a:pt x="225552" y="114300"/>
-                                      </a:lnTo>
-                                      <a:lnTo>
-                                        <a:pt x="225552" y="216408"/>
-                                      </a:lnTo>
-                                      <a:lnTo>
-                                        <a:pt x="6096" y="216408"/>
-                                      </a:lnTo>
-                                      <a:lnTo>
-                                        <a:pt x="6096" y="222504"/>
-                                      </a:lnTo>
-                                      <a:lnTo>
-                                        <a:pt x="225552" y="222504"/>
-                                      </a:lnTo>
-                                      <a:lnTo>
-                                        <a:pt x="231648" y="222504"/>
-                                      </a:lnTo>
-                                      <a:lnTo>
-                                        <a:pt x="231648" y="216408"/>
-                                      </a:lnTo>
-                                      <a:lnTo>
-                                        <a:pt x="231648" y="114300"/>
-                                      </a:lnTo>
-                                      <a:lnTo>
-                                        <a:pt x="231648" y="108204"/>
-                                      </a:lnTo>
-                                      <a:lnTo>
-                                        <a:pt x="231648" y="6108"/>
-                                      </a:lnTo>
-                                      <a:close/>
-                                    </a:path>
-                                    <a:path w="231775" h="222885">
-                                      <a:moveTo>
-                                        <a:pt x="231648" y="0"/>
-                                      </a:moveTo>
-                                      <a:lnTo>
-                                        <a:pt x="225552" y="0"/>
-                                      </a:lnTo>
-                                      <a:lnTo>
-                                        <a:pt x="6096" y="0"/>
-                                      </a:lnTo>
-                                      <a:lnTo>
-                                        <a:pt x="6096" y="6096"/>
-                                      </a:lnTo>
-                                      <a:lnTo>
-                                        <a:pt x="225552" y="6096"/>
-                                      </a:lnTo>
-                                      <a:lnTo>
-                                        <a:pt x="231648" y="6096"/>
-                                      </a:lnTo>
-                                      <a:lnTo>
-                                        <a:pt x="231648" y="0"/>
-                                      </a:lnTo>
-                                      <a:close/>
-                                    </a:path>
-                                  </a:pathLst>
-                                </a:custGeom>
-                                <a:solidFill>
-                                  <a:srgbClr val="000000"/>
-                                </a:solidFill>
-                              </wps:spPr>
-                              <wps:bodyPr wrap="square" lIns="0" tIns="0" rIns="0" bIns="0" rtlCol="0">
-                                <a:prstTxWarp prst="textNoShape">
-                                  <a:avLst/>
-                                </a:prstTxWarp>
-                                <a:noAutofit/>
-                              </wps:bodyPr>
-                            </wps:wsp>
-                          </wpg:wgp>
-                        </a:graphicData>
-                      </a:graphic>
-                      <wp14:sizeRelV relativeFrom="margin">
-                        <wp14:pctHeight>0</wp14:pctHeight>
-                      </wp14:sizeRelV>
-                    </wp:anchor>
-                  </w:drawing>
-                </mc:Choice>
-                <mc:Fallback>
-                  <w:pict>
-                    <v:group w14:anchorId="58ABE0EA" id="Group 9" o:spid="_x0000_s1026" style="position:absolute;margin-left:268.7pt;margin-top:9.25pt;width:18.25pt;height:10.65pt;z-index:-251650560;mso-wrap-distance-left:0;mso-wrap-distance-right:0;mso-height-relative:margin" coordsize="231775,222885" o:gfxdata="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">
-                      <v:shape id="Graphic 10" o:spid="_x0000_s1027" style="position:absolute;width:231775;height:222885;visibility:visible;mso-wrap-style:square;v-text-anchor:top" coordsize="231775,222885" o:gfxdata="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" path="m6083,6108l,6108,,108204r,6096l,216408r,6096l6083,222504r,-6096l6083,114300r,-6096l6083,6108xem6083,l,,,6096r6083,l6083,xem231648,6108r-6096,l225552,108204r,6096l225552,216408r-219456,l6096,222504r219456,l231648,222504r,-6096l231648,114300r,-6096l231648,6108xem231648,r-6096,l6096,r,6096l225552,6096r6096,l231648,xe" fillcolor="black" stroked="f">
-                        <v:path arrowok="t"/>
-                      </v:shape>
-                    </v:group>
-                  </w:pict>
-                </mc:Fallback>
-              </mc:AlternateContent>
-            </w:r>
             <w:r>
               <w:rPr>
                 <w:i/>
@@ -2215,214 +1565,6 @@
             </w:pPr>
             <w:r>
               <w:rPr>
-                <w:noProof/>
-                <w:sz w:val="14"/>
-              </w:rPr>
-              <mc:AlternateContent>
-                <mc:Choice Requires="wpg">
-                  <w:drawing>
-                    <wp:anchor distT="0" distB="0" distL="0" distR="0" simplePos="0" relativeHeight="251693568" behindDoc="1" locked="0" layoutInCell="1" allowOverlap="1" wp14:anchorId="137B28EB" wp14:editId="024A55C4">
-                      <wp:simplePos x="0" y="0"/>
-                      <wp:positionH relativeFrom="column">
-                        <wp:posOffset>82082</wp:posOffset>
-                      </wp:positionH>
-                      <wp:positionV relativeFrom="paragraph">
-                        <wp:posOffset>107315</wp:posOffset>
-                      </wp:positionV>
-                      <wp:extent cx="200025" cy="127000"/>
-                      <wp:effectExtent l="0" t="0" r="9525" b="6350"/>
-                      <wp:wrapNone/>
-                      <wp:docPr id="1559917211" name="Group 1559917211"/>
-                      <wp:cNvGraphicFramePr>
-                        <a:graphicFrameLocks xmlns:a="http://schemas.openxmlformats.org/drawingml/2006/main"/>
-                      </wp:cNvGraphicFramePr>
-                      <a:graphic xmlns:a="http://schemas.openxmlformats.org/drawingml/2006/main">
-                        <a:graphicData uri="http://schemas.microsoft.com/office/word/2010/wordprocessingGroup">
-                          <wpg:wgp>
-                            <wpg:cNvGrpSpPr>
-                              <a:grpSpLocks/>
-                            </wpg:cNvGrpSpPr>
-                            <wpg:grpSpPr>
-                              <a:xfrm>
-                                <a:off x="0" y="0"/>
-                                <a:ext cx="200025" cy="127000"/>
-                                <a:chOff x="0" y="0"/>
-                                <a:chExt cx="180340" cy="222885"/>
-                              </a:xfrm>
-                            </wpg:grpSpPr>
-                            <wps:wsp>
-                              <wps:cNvPr id="1813280594" name="Graphic 12"/>
-                              <wps:cNvSpPr/>
-                              <wps:spPr>
-                                <a:xfrm>
-                                  <a:off x="0" y="0"/>
-                                  <a:ext cx="180340" cy="222885"/>
-                                </a:xfrm>
-                                <a:custGeom>
-                                  <a:avLst/>
-                                  <a:gdLst/>
-                                  <a:ahLst/>
-                                  <a:cxnLst/>
-                                  <a:rect l="l" t="t" r="r" b="b"/>
-                                  <a:pathLst>
-                                    <a:path w="180340" h="222885">
-                                      <a:moveTo>
-                                        <a:pt x="174040" y="216408"/>
-                                      </a:moveTo>
-                                      <a:lnTo>
-                                        <a:pt x="6096" y="216408"/>
-                                      </a:lnTo>
-                                      <a:lnTo>
-                                        <a:pt x="6096" y="114300"/>
-                                      </a:lnTo>
-                                      <a:lnTo>
-                                        <a:pt x="6096" y="108204"/>
-                                      </a:lnTo>
-                                      <a:lnTo>
-                                        <a:pt x="6096" y="6108"/>
-                                      </a:lnTo>
-                                      <a:lnTo>
-                                        <a:pt x="0" y="6108"/>
-                                      </a:lnTo>
-                                      <a:lnTo>
-                                        <a:pt x="0" y="108204"/>
-                                      </a:lnTo>
-                                      <a:lnTo>
-                                        <a:pt x="0" y="114300"/>
-                                      </a:lnTo>
-                                      <a:lnTo>
-                                        <a:pt x="0" y="216408"/>
-                                      </a:lnTo>
-                                      <a:lnTo>
-                                        <a:pt x="0" y="222504"/>
-                                      </a:lnTo>
-                                      <a:lnTo>
-                                        <a:pt x="6096" y="222504"/>
-                                      </a:lnTo>
-                                      <a:lnTo>
-                                        <a:pt x="174040" y="222504"/>
-                                      </a:lnTo>
-                                      <a:lnTo>
-                                        <a:pt x="174040" y="216408"/>
-                                      </a:lnTo>
-                                      <a:close/>
-                                    </a:path>
-                                    <a:path w="180340" h="222885">
-                                      <a:moveTo>
-                                        <a:pt x="174040" y="0"/>
-                                      </a:moveTo>
-                                      <a:lnTo>
-                                        <a:pt x="6096" y="0"/>
-                                      </a:lnTo>
-                                      <a:lnTo>
-                                        <a:pt x="0" y="0"/>
-                                      </a:lnTo>
-                                      <a:lnTo>
-                                        <a:pt x="0" y="6096"/>
-                                      </a:lnTo>
-                                      <a:lnTo>
-                                        <a:pt x="6096" y="6096"/>
-                                      </a:lnTo>
-                                      <a:lnTo>
-                                        <a:pt x="174040" y="6096"/>
-                                      </a:lnTo>
-                                      <a:lnTo>
-                                        <a:pt x="174040" y="0"/>
-                                      </a:lnTo>
-                                      <a:close/>
-                                    </a:path>
-                                    <a:path w="180340" h="222885">
-                                      <a:moveTo>
-                                        <a:pt x="180213" y="6108"/>
-                                      </a:moveTo>
-                                      <a:lnTo>
-                                        <a:pt x="174117" y="6108"/>
-                                      </a:lnTo>
-                                      <a:lnTo>
-                                        <a:pt x="174117" y="108204"/>
-                                      </a:lnTo>
-                                      <a:lnTo>
-                                        <a:pt x="174117" y="114300"/>
-                                      </a:lnTo>
-                                      <a:lnTo>
-                                        <a:pt x="174117" y="216408"/>
-                                      </a:lnTo>
-                                      <a:lnTo>
-                                        <a:pt x="174117" y="222504"/>
-                                      </a:lnTo>
-                                      <a:lnTo>
-                                        <a:pt x="180213" y="222504"/>
-                                      </a:lnTo>
-                                      <a:lnTo>
-                                        <a:pt x="180213" y="216408"/>
-                                      </a:lnTo>
-                                      <a:lnTo>
-                                        <a:pt x="180213" y="114300"/>
-                                      </a:lnTo>
-                                      <a:lnTo>
-                                        <a:pt x="180213" y="108204"/>
-                                      </a:lnTo>
-                                      <a:lnTo>
-                                        <a:pt x="180213" y="6108"/>
-                                      </a:lnTo>
-                                      <a:close/>
-                                    </a:path>
-                                    <a:path w="180340" h="222885">
-                                      <a:moveTo>
-                                        <a:pt x="180213" y="0"/>
-                                      </a:moveTo>
-                                      <a:lnTo>
-                                        <a:pt x="174117" y="0"/>
-                                      </a:lnTo>
-                                      <a:lnTo>
-                                        <a:pt x="174117" y="6096"/>
-                                      </a:lnTo>
-                                      <a:lnTo>
-                                        <a:pt x="180213" y="6096"/>
-                                      </a:lnTo>
-                                      <a:lnTo>
-                                        <a:pt x="180213" y="0"/>
-                                      </a:lnTo>
-                                      <a:close/>
-                                    </a:path>
-                                  </a:pathLst>
-                                </a:custGeom>
-                                <a:solidFill>
-                                  <a:srgbClr val="000000"/>
-                                </a:solidFill>
-                              </wps:spPr>
-                              <wps:bodyPr wrap="square" lIns="0" tIns="0" rIns="0" bIns="0" rtlCol="0">
-                                <a:prstTxWarp prst="textNoShape">
-                                  <a:avLst/>
-                                </a:prstTxWarp>
-                                <a:noAutofit/>
-                              </wps:bodyPr>
-                            </wps:wsp>
-                          </wpg:wgp>
-                        </a:graphicData>
-                      </a:graphic>
-                      <wp14:sizeRelH relativeFrom="margin">
-                        <wp14:pctWidth>0</wp14:pctWidth>
-                      </wp14:sizeRelH>
-                      <wp14:sizeRelV relativeFrom="margin">
-                        <wp14:pctHeight>0</wp14:pctHeight>
-                      </wp14:sizeRelV>
-                    </wp:anchor>
-                  </w:drawing>
-                </mc:Choice>
-                <mc:Fallback>
-                  <w:pict>
-                    <v:group w14:anchorId="5E82E1AB" id="Group 1559917211" o:spid="_x0000_s1026" style="position:absolute;margin-left:6.45pt;margin-top:8.45pt;width:15.75pt;height:10pt;z-index:-251622912;mso-wrap-distance-left:0;mso-wrap-distance-right:0;mso-width-relative:margin;mso-height-relative:margin" coordsize="180340,222885" o:gfxdata="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">
-                      <v:shape id="Graphic 12" o:spid="_x0000_s1027" style="position:absolute;width:180340;height:222885;visibility:visible;mso-wrap-style:square;v-text-anchor:top" coordsize="180340,222885" o:gfxdata="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" path="m174040,216408r-167944,l6096,114300r,-6096l6096,6108,,6108,,108204r,6096l,216408r,6096l6096,222504r167944,l174040,216408xem174040,l6096,,,,,6096r6096,l174040,6096r,-6096xem180213,6108r-6096,l174117,108204r,6096l174117,216408r,6096l180213,222504r,-6096l180213,114300r,-6096l180213,6108xem180213,r-6096,l174117,6096r6096,l180213,xe" fillcolor="black" stroked="f">
-                        <v:path arrowok="t"/>
-                      </v:shape>
-                    </v:group>
-                  </w:pict>
-                </mc:Fallback>
-              </mc:AlternateContent>
-            </w:r>
-            <w:r>
-              <w:rPr>
                 <w:sz w:val="14"/>
               </w:rPr>
               <w:t>Planning</w:t>
@@ -2469,214 +1611,6 @@
                 <w:lang w:val="en-MY"/>
               </w:rPr>
             </w:pPr>
-            <w:r>
-              <w:rPr>
-                <w:noProof/>
-                <w:sz w:val="14"/>
-              </w:rPr>
-              <mc:AlternateContent>
-                <mc:Choice Requires="wpg">
-                  <w:drawing>
-                    <wp:anchor distT="0" distB="0" distL="0" distR="0" simplePos="0" relativeHeight="251688448" behindDoc="1" locked="0" layoutInCell="1" allowOverlap="1" wp14:anchorId="2319061E" wp14:editId="5D8A7224">
-                      <wp:simplePos x="0" y="0"/>
-                      <wp:positionH relativeFrom="column">
-                        <wp:posOffset>1971207</wp:posOffset>
-                      </wp:positionH>
-                      <wp:positionV relativeFrom="paragraph">
-                        <wp:posOffset>10795</wp:posOffset>
-                      </wp:positionV>
-                      <wp:extent cx="200367" cy="127506"/>
-                      <wp:effectExtent l="0" t="0" r="9525" b="6350"/>
-                      <wp:wrapNone/>
-                      <wp:docPr id="273477450" name="Group 273477450"/>
-                      <wp:cNvGraphicFramePr>
-                        <a:graphicFrameLocks xmlns:a="http://schemas.openxmlformats.org/drawingml/2006/main"/>
-                      </wp:cNvGraphicFramePr>
-                      <a:graphic xmlns:a="http://schemas.openxmlformats.org/drawingml/2006/main">
-                        <a:graphicData uri="http://schemas.microsoft.com/office/word/2010/wordprocessingGroup">
-                          <wpg:wgp>
-                            <wpg:cNvGrpSpPr>
-                              <a:grpSpLocks/>
-                            </wpg:cNvGrpSpPr>
-                            <wpg:grpSpPr>
-                              <a:xfrm>
-                                <a:off x="0" y="0"/>
-                                <a:ext cx="200367" cy="127506"/>
-                                <a:chOff x="0" y="0"/>
-                                <a:chExt cx="180340" cy="222885"/>
-                              </a:xfrm>
-                            </wpg:grpSpPr>
-                            <wps:wsp>
-                              <wps:cNvPr id="505995932" name="Graphic 12"/>
-                              <wps:cNvSpPr/>
-                              <wps:spPr>
-                                <a:xfrm>
-                                  <a:off x="0" y="0"/>
-                                  <a:ext cx="180340" cy="222885"/>
-                                </a:xfrm>
-                                <a:custGeom>
-                                  <a:avLst/>
-                                  <a:gdLst/>
-                                  <a:ahLst/>
-                                  <a:cxnLst/>
-                                  <a:rect l="l" t="t" r="r" b="b"/>
-                                  <a:pathLst>
-                                    <a:path w="180340" h="222885">
-                                      <a:moveTo>
-                                        <a:pt x="174040" y="216408"/>
-                                      </a:moveTo>
-                                      <a:lnTo>
-                                        <a:pt x="6096" y="216408"/>
-                                      </a:lnTo>
-                                      <a:lnTo>
-                                        <a:pt x="6096" y="114300"/>
-                                      </a:lnTo>
-                                      <a:lnTo>
-                                        <a:pt x="6096" y="108204"/>
-                                      </a:lnTo>
-                                      <a:lnTo>
-                                        <a:pt x="6096" y="6108"/>
-                                      </a:lnTo>
-                                      <a:lnTo>
-                                        <a:pt x="0" y="6108"/>
-                                      </a:lnTo>
-                                      <a:lnTo>
-                                        <a:pt x="0" y="108204"/>
-                                      </a:lnTo>
-                                      <a:lnTo>
-                                        <a:pt x="0" y="114300"/>
-                                      </a:lnTo>
-                                      <a:lnTo>
-                                        <a:pt x="0" y="216408"/>
-                                      </a:lnTo>
-                                      <a:lnTo>
-                                        <a:pt x="0" y="222504"/>
-                                      </a:lnTo>
-                                      <a:lnTo>
-                                        <a:pt x="6096" y="222504"/>
-                                      </a:lnTo>
-                                      <a:lnTo>
-                                        <a:pt x="174040" y="222504"/>
-                                      </a:lnTo>
-                                      <a:lnTo>
-                                        <a:pt x="174040" y="216408"/>
-                                      </a:lnTo>
-                                      <a:close/>
-                                    </a:path>
-                                    <a:path w="180340" h="222885">
-                                      <a:moveTo>
-                                        <a:pt x="174040" y="0"/>
-                                      </a:moveTo>
-                                      <a:lnTo>
-                                        <a:pt x="6096" y="0"/>
-                                      </a:lnTo>
-                                      <a:lnTo>
-                                        <a:pt x="0" y="0"/>
-                                      </a:lnTo>
-                                      <a:lnTo>
-                                        <a:pt x="0" y="6096"/>
-                                      </a:lnTo>
-                                      <a:lnTo>
-                                        <a:pt x="6096" y="6096"/>
-                                      </a:lnTo>
-                                      <a:lnTo>
-                                        <a:pt x="174040" y="6096"/>
-                                      </a:lnTo>
-                                      <a:lnTo>
-                                        <a:pt x="174040" y="0"/>
-                                      </a:lnTo>
-                                      <a:close/>
-                                    </a:path>
-                                    <a:path w="180340" h="222885">
-                                      <a:moveTo>
-                                        <a:pt x="180213" y="6108"/>
-                                      </a:moveTo>
-                                      <a:lnTo>
-                                        <a:pt x="174117" y="6108"/>
-                                      </a:lnTo>
-                                      <a:lnTo>
-                                        <a:pt x="174117" y="108204"/>
-                                      </a:lnTo>
-                                      <a:lnTo>
-                                        <a:pt x="174117" y="114300"/>
-                                      </a:lnTo>
-                                      <a:lnTo>
-                                        <a:pt x="174117" y="216408"/>
-                                      </a:lnTo>
-                                      <a:lnTo>
-                                        <a:pt x="174117" y="222504"/>
-                                      </a:lnTo>
-                                      <a:lnTo>
-                                        <a:pt x="180213" y="222504"/>
-                                      </a:lnTo>
-                                      <a:lnTo>
-                                        <a:pt x="180213" y="216408"/>
-                                      </a:lnTo>
-                                      <a:lnTo>
-                                        <a:pt x="180213" y="114300"/>
-                                      </a:lnTo>
-                                      <a:lnTo>
-                                        <a:pt x="180213" y="108204"/>
-                                      </a:lnTo>
-                                      <a:lnTo>
-                                        <a:pt x="180213" y="6108"/>
-                                      </a:lnTo>
-                                      <a:close/>
-                                    </a:path>
-                                    <a:path w="180340" h="222885">
-                                      <a:moveTo>
-                                        <a:pt x="180213" y="0"/>
-                                      </a:moveTo>
-                                      <a:lnTo>
-                                        <a:pt x="174117" y="0"/>
-                                      </a:lnTo>
-                                      <a:lnTo>
-                                        <a:pt x="174117" y="6096"/>
-                                      </a:lnTo>
-                                      <a:lnTo>
-                                        <a:pt x="180213" y="6096"/>
-                                      </a:lnTo>
-                                      <a:lnTo>
-                                        <a:pt x="180213" y="0"/>
-                                      </a:lnTo>
-                                      <a:close/>
-                                    </a:path>
-                                  </a:pathLst>
-                                </a:custGeom>
-                                <a:solidFill>
-                                  <a:srgbClr val="000000"/>
-                                </a:solidFill>
-                              </wps:spPr>
-                              <wps:bodyPr wrap="square" lIns="0" tIns="0" rIns="0" bIns="0" rtlCol="0">
-                                <a:prstTxWarp prst="textNoShape">
-                                  <a:avLst/>
-                                </a:prstTxWarp>
-                                <a:noAutofit/>
-                              </wps:bodyPr>
-                            </wps:wsp>
-                          </wpg:wgp>
-                        </a:graphicData>
-                      </a:graphic>
-                      <wp14:sizeRelH relativeFrom="margin">
-                        <wp14:pctWidth>0</wp14:pctWidth>
-                      </wp14:sizeRelH>
-                      <wp14:sizeRelV relativeFrom="margin">
-                        <wp14:pctHeight>0</wp14:pctHeight>
-                      </wp14:sizeRelV>
-                    </wp:anchor>
-                  </w:drawing>
-                </mc:Choice>
-                <mc:Fallback>
-                  <w:pict>
-                    <v:group w14:anchorId="0E49363D" id="Group 273477450" o:spid="_x0000_s1026" style="position:absolute;margin-left:155.2pt;margin-top:.85pt;width:15.8pt;height:10.05pt;z-index:-251628032;mso-wrap-distance-left:0;mso-wrap-distance-right:0;mso-width-relative:margin;mso-height-relative:margin" coordsize="180340,222885" o:gfxdata="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">
-                      <v:shape id="Graphic 12" o:spid="_x0000_s1027" style="position:absolute;width:180340;height:222885;visibility:visible;mso-wrap-style:square;v-text-anchor:top" coordsize="180340,222885" o:gfxdata="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" path="m174040,216408r-167944,l6096,114300r,-6096l6096,6108,,6108,,108204r,6096l,216408r,6096l6096,222504r167944,l174040,216408xem174040,l6096,,,,,6096r6096,l174040,6096r,-6096xem180213,6108r-6096,l174117,108204r,6096l174117,216408r,6096l180213,222504r,-6096l180213,114300r,-6096l180213,6108xem180213,r-6096,l174117,6096r6096,l180213,xe" fillcolor="black" stroked="f">
-                        <v:path arrowok="t"/>
-                      </v:shape>
-                    </v:group>
-                  </w:pict>
-                </mc:Fallback>
-              </mc:AlternateContent>
-            </w:r>
             <w:r>
               <w:rPr>
                 <w:sz w:val="14"/>
@@ -2807,7 +1741,6 @@
         <w:tc>
           <w:tcPr>
             <w:tcW w:w="9026" w:type="dxa"/>
-            <w:gridSpan w:val="6"/>
           </w:tcPr>
           <w:p>
             <w:pPr>
@@ -2817,214 +1750,6 @@
                 <w:sz w:val="14"/>
               </w:rPr>
             </w:pPr>
-            <w:r>
-              <w:rPr>
-                <w:noProof/>
-                <w:sz w:val="14"/>
-              </w:rPr>
-              <mc:AlternateContent>
-                <mc:Choice Requires="wpg">
-                  <w:drawing>
-                    <wp:anchor distT="0" distB="0" distL="0" distR="0" simplePos="0" relativeHeight="251677184" behindDoc="1" locked="0" layoutInCell="1" allowOverlap="1" wp14:anchorId="34BAFB68" wp14:editId="624C6CE6">
-                      <wp:simplePos x="0" y="0"/>
-                      <wp:positionH relativeFrom="column">
-                        <wp:posOffset>3410809</wp:posOffset>
-                      </wp:positionH>
-                      <wp:positionV relativeFrom="paragraph">
-                        <wp:posOffset>-220861</wp:posOffset>
-                      </wp:positionV>
-                      <wp:extent cx="236797" cy="127506"/>
-                      <wp:effectExtent l="0" t="0" r="0" b="6350"/>
-                      <wp:wrapNone/>
-                      <wp:docPr id="11" name="Group 11"/>
-                      <wp:cNvGraphicFramePr>
-                        <a:graphicFrameLocks xmlns:a="http://schemas.openxmlformats.org/drawingml/2006/main"/>
-                      </wp:cNvGraphicFramePr>
-                      <a:graphic xmlns:a="http://schemas.openxmlformats.org/drawingml/2006/main">
-                        <a:graphicData uri="http://schemas.microsoft.com/office/word/2010/wordprocessingGroup">
-                          <wpg:wgp>
-                            <wpg:cNvGrpSpPr>
-                              <a:grpSpLocks/>
-                            </wpg:cNvGrpSpPr>
-                            <wpg:grpSpPr>
-                              <a:xfrm>
-                                <a:off x="0" y="0"/>
-                                <a:ext cx="236797" cy="127506"/>
-                                <a:chOff x="0" y="0"/>
-                                <a:chExt cx="180340" cy="222885"/>
-                              </a:xfrm>
-                            </wpg:grpSpPr>
-                            <wps:wsp>
-                              <wps:cNvPr id="12" name="Graphic 12"/>
-                              <wps:cNvSpPr/>
-                              <wps:spPr>
-                                <a:xfrm>
-                                  <a:off x="0" y="0"/>
-                                  <a:ext cx="180340" cy="222885"/>
-                                </a:xfrm>
-                                <a:custGeom>
-                                  <a:avLst/>
-                                  <a:gdLst/>
-                                  <a:ahLst/>
-                                  <a:cxnLst/>
-                                  <a:rect l="l" t="t" r="r" b="b"/>
-                                  <a:pathLst>
-                                    <a:path w="180340" h="222885">
-                                      <a:moveTo>
-                                        <a:pt x="174040" y="216408"/>
-                                      </a:moveTo>
-                                      <a:lnTo>
-                                        <a:pt x="6096" y="216408"/>
-                                      </a:lnTo>
-                                      <a:lnTo>
-                                        <a:pt x="6096" y="114300"/>
-                                      </a:lnTo>
-                                      <a:lnTo>
-                                        <a:pt x="6096" y="108204"/>
-                                      </a:lnTo>
-                                      <a:lnTo>
-                                        <a:pt x="6096" y="6108"/>
-                                      </a:lnTo>
-                                      <a:lnTo>
-                                        <a:pt x="0" y="6108"/>
-                                      </a:lnTo>
-                                      <a:lnTo>
-                                        <a:pt x="0" y="108204"/>
-                                      </a:lnTo>
-                                      <a:lnTo>
-                                        <a:pt x="0" y="114300"/>
-                                      </a:lnTo>
-                                      <a:lnTo>
-                                        <a:pt x="0" y="216408"/>
-                                      </a:lnTo>
-                                      <a:lnTo>
-                                        <a:pt x="0" y="222504"/>
-                                      </a:lnTo>
-                                      <a:lnTo>
-                                        <a:pt x="6096" y="222504"/>
-                                      </a:lnTo>
-                                      <a:lnTo>
-                                        <a:pt x="174040" y="222504"/>
-                                      </a:lnTo>
-                                      <a:lnTo>
-                                        <a:pt x="174040" y="216408"/>
-                                      </a:lnTo>
-                                      <a:close/>
-                                    </a:path>
-                                    <a:path w="180340" h="222885">
-                                      <a:moveTo>
-                                        <a:pt x="174040" y="0"/>
-                                      </a:moveTo>
-                                      <a:lnTo>
-                                        <a:pt x="6096" y="0"/>
-                                      </a:lnTo>
-                                      <a:lnTo>
-                                        <a:pt x="0" y="0"/>
-                                      </a:lnTo>
-                                      <a:lnTo>
-                                        <a:pt x="0" y="6096"/>
-                                      </a:lnTo>
-                                      <a:lnTo>
-                                        <a:pt x="6096" y="6096"/>
-                                      </a:lnTo>
-                                      <a:lnTo>
-                                        <a:pt x="174040" y="6096"/>
-                                      </a:lnTo>
-                                      <a:lnTo>
-                                        <a:pt x="174040" y="0"/>
-                                      </a:lnTo>
-                                      <a:close/>
-                                    </a:path>
-                                    <a:path w="180340" h="222885">
-                                      <a:moveTo>
-                                        <a:pt x="180213" y="6108"/>
-                                      </a:moveTo>
-                                      <a:lnTo>
-                                        <a:pt x="174117" y="6108"/>
-                                      </a:lnTo>
-                                      <a:lnTo>
-                                        <a:pt x="174117" y="108204"/>
-                                      </a:lnTo>
-                                      <a:lnTo>
-                                        <a:pt x="174117" y="114300"/>
-                                      </a:lnTo>
-                                      <a:lnTo>
-                                        <a:pt x="174117" y="216408"/>
-                                      </a:lnTo>
-                                      <a:lnTo>
-                                        <a:pt x="174117" y="222504"/>
-                                      </a:lnTo>
-                                      <a:lnTo>
-                                        <a:pt x="180213" y="222504"/>
-                                      </a:lnTo>
-                                      <a:lnTo>
-                                        <a:pt x="180213" y="216408"/>
-                                      </a:lnTo>
-                                      <a:lnTo>
-                                        <a:pt x="180213" y="114300"/>
-                                      </a:lnTo>
-                                      <a:lnTo>
-                                        <a:pt x="180213" y="108204"/>
-                                      </a:lnTo>
-                                      <a:lnTo>
-                                        <a:pt x="180213" y="6108"/>
-                                      </a:lnTo>
-                                      <a:close/>
-                                    </a:path>
-                                    <a:path w="180340" h="222885">
-                                      <a:moveTo>
-                                        <a:pt x="180213" y="0"/>
-                                      </a:moveTo>
-                                      <a:lnTo>
-                                        <a:pt x="174117" y="0"/>
-                                      </a:lnTo>
-                                      <a:lnTo>
-                                        <a:pt x="174117" y="6096"/>
-                                      </a:lnTo>
-                                      <a:lnTo>
-                                        <a:pt x="180213" y="6096"/>
-                                      </a:lnTo>
-                                      <a:lnTo>
-                                        <a:pt x="180213" y="0"/>
-                                      </a:lnTo>
-                                      <a:close/>
-                                    </a:path>
-                                  </a:pathLst>
-                                </a:custGeom>
-                                <a:solidFill>
-                                  <a:srgbClr val="000000"/>
-                                </a:solidFill>
-                              </wps:spPr>
-                              <wps:bodyPr wrap="square" lIns="0" tIns="0" rIns="0" bIns="0" rtlCol="0">
-                                <a:prstTxWarp prst="textNoShape">
-                                  <a:avLst/>
-                                </a:prstTxWarp>
-                                <a:noAutofit/>
-                              </wps:bodyPr>
-                            </wps:wsp>
-                          </wpg:wgp>
-                        </a:graphicData>
-                      </a:graphic>
-                      <wp14:sizeRelH relativeFrom="margin">
-                        <wp14:pctWidth>0</wp14:pctWidth>
-                      </wp14:sizeRelH>
-                      <wp14:sizeRelV relativeFrom="margin">
-                        <wp14:pctHeight>0</wp14:pctHeight>
-                      </wp14:sizeRelV>
-                    </wp:anchor>
-                  </w:drawing>
-                </mc:Choice>
-                <mc:Fallback>
-                  <w:pict>
-                    <v:group w14:anchorId="49E82694" id="Group 11" o:spid="_x0000_s1026" style="position:absolute;margin-left:268.55pt;margin-top:-17.4pt;width:18.65pt;height:10.05pt;z-index:-251639296;mso-wrap-distance-left:0;mso-wrap-distance-right:0;mso-width-relative:margin;mso-height-relative:margin" coordsize="180340,222885" o:gfxdata="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">
-                      <v:shape id="Graphic 12" o:spid="_x0000_s1027" style="position:absolute;width:180340;height:222885;visibility:visible;mso-wrap-style:square;v-text-anchor:top" coordsize="180340,222885" o:gfxdata="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" path="m174040,216408r-167944,l6096,114300r,-6096l6096,6108,,6108,,108204r,6096l,216408r,6096l6096,222504r167944,l174040,216408xem174040,l6096,,,,,6096r6096,l174040,6096r,-6096xem180213,6108r-6096,l174117,108204r,6096l174117,216408r,6096l180213,222504r,-6096l180213,114300r,-6096l180213,6108xem180213,r-6096,l174117,6096r6096,l180213,xe" fillcolor="black" stroked="f">
-                        <v:path arrowok="t"/>
-                      </v:shape>
-                    </v:group>
-                  </w:pict>
-                </mc:Fallback>
-              </mc:AlternateContent>
-            </w:r>
           </w:p>
         </w:tc>
       </w:tr>
@@ -3035,7 +1760,6 @@
         <w:tc>
           <w:tcPr>
             <w:tcW w:w="9026" w:type="dxa"/>
-            <w:gridSpan w:val="6"/>
           </w:tcPr>
           <w:p>
             <w:pPr>
@@ -3126,574 +1850,6 @@
                 <w:sz w:val="16"/>
               </w:rPr>
             </w:pPr>
-            <w:r>
-              <w:rPr>
-                <w:b/>
-                <w:noProof/>
-                <w:sz w:val="16"/>
-              </w:rPr>
-              <mc:AlternateContent>
-                <mc:Choice Requires="wpg">
-                  <w:drawing>
-                    <wp:anchor distT="0" distB="0" distL="0" distR="0" simplePos="0" relativeHeight="251694592" behindDoc="1" locked="0" layoutInCell="1" allowOverlap="1" wp14:anchorId="254F2DD5" wp14:editId="699E10CE">
-                      <wp:simplePos x="0" y="0"/>
-                      <wp:positionH relativeFrom="column">
-                        <wp:posOffset>70154</wp:posOffset>
-                      </wp:positionH>
-                      <wp:positionV relativeFrom="paragraph">
-                        <wp:posOffset>115818</wp:posOffset>
-                      </wp:positionV>
-                      <wp:extent cx="219710" cy="109291"/>
-                      <wp:effectExtent l="0" t="0" r="8890" b="5080"/>
-                      <wp:wrapNone/>
-                      <wp:docPr id="1083716320" name="Group 1083716320"/>
-                      <wp:cNvGraphicFramePr>
-                        <a:graphicFrameLocks xmlns:a="http://schemas.openxmlformats.org/drawingml/2006/main"/>
-                      </wp:cNvGraphicFramePr>
-                      <a:graphic xmlns:a="http://schemas.openxmlformats.org/drawingml/2006/main">
-                        <a:graphicData uri="http://schemas.microsoft.com/office/word/2010/wordprocessingGroup">
-                          <wpg:wgp>
-                            <wpg:cNvGrpSpPr>
-                              <a:grpSpLocks/>
-                            </wpg:cNvGrpSpPr>
-                            <wpg:grpSpPr>
-                              <a:xfrm>
-                                <a:off x="0" y="0"/>
-                                <a:ext cx="219710" cy="109291"/>
-                                <a:chOff x="0" y="0"/>
-                                <a:chExt cx="219710" cy="222885"/>
-                              </a:xfrm>
-                            </wpg:grpSpPr>
-                            <wps:wsp>
-                              <wps:cNvPr id="1161824409" name="Graphic 6"/>
-                              <wps:cNvSpPr/>
-                              <wps:spPr>
-                                <a:xfrm>
-                                  <a:off x="0" y="0"/>
-                                  <a:ext cx="219710" cy="222885"/>
-                                </a:xfrm>
-                                <a:custGeom>
-                                  <a:avLst/>
-                                  <a:gdLst/>
-                                  <a:ahLst/>
-                                  <a:cxnLst/>
-                                  <a:rect l="l" t="t" r="r" b="b"/>
-                                  <a:pathLst>
-                                    <a:path w="219710" h="222885">
-                                      <a:moveTo>
-                                        <a:pt x="219456" y="6108"/>
-                                      </a:moveTo>
-                                      <a:lnTo>
-                                        <a:pt x="213360" y="6108"/>
-                                      </a:lnTo>
-                                      <a:lnTo>
-                                        <a:pt x="213360" y="108204"/>
-                                      </a:lnTo>
-                                      <a:lnTo>
-                                        <a:pt x="213360" y="114300"/>
-                                      </a:lnTo>
-                                      <a:lnTo>
-                                        <a:pt x="213360" y="216408"/>
-                                      </a:lnTo>
-                                      <a:lnTo>
-                                        <a:pt x="6096" y="216408"/>
-                                      </a:lnTo>
-                                      <a:lnTo>
-                                        <a:pt x="6096" y="114300"/>
-                                      </a:lnTo>
-                                      <a:lnTo>
-                                        <a:pt x="6096" y="108204"/>
-                                      </a:lnTo>
-                                      <a:lnTo>
-                                        <a:pt x="6096" y="6108"/>
-                                      </a:lnTo>
-                                      <a:lnTo>
-                                        <a:pt x="0" y="6108"/>
-                                      </a:lnTo>
-                                      <a:lnTo>
-                                        <a:pt x="0" y="108204"/>
-                                      </a:lnTo>
-                                      <a:lnTo>
-                                        <a:pt x="0" y="114300"/>
-                                      </a:lnTo>
-                                      <a:lnTo>
-                                        <a:pt x="0" y="216408"/>
-                                      </a:lnTo>
-                                      <a:lnTo>
-                                        <a:pt x="0" y="222504"/>
-                                      </a:lnTo>
-                                      <a:lnTo>
-                                        <a:pt x="6096" y="222504"/>
-                                      </a:lnTo>
-                                      <a:lnTo>
-                                        <a:pt x="213360" y="222504"/>
-                                      </a:lnTo>
-                                      <a:lnTo>
-                                        <a:pt x="219456" y="222504"/>
-                                      </a:lnTo>
-                                      <a:lnTo>
-                                        <a:pt x="219456" y="216408"/>
-                                      </a:lnTo>
-                                      <a:lnTo>
-                                        <a:pt x="219456" y="114300"/>
-                                      </a:lnTo>
-                                      <a:lnTo>
-                                        <a:pt x="219456" y="108204"/>
-                                      </a:lnTo>
-                                      <a:lnTo>
-                                        <a:pt x="219456" y="6108"/>
-                                      </a:lnTo>
-                                      <a:close/>
-                                    </a:path>
-                                    <a:path w="219710" h="222885">
-                                      <a:moveTo>
-                                        <a:pt x="219456" y="0"/>
-                                      </a:moveTo>
-                                      <a:lnTo>
-                                        <a:pt x="213360" y="0"/>
-                                      </a:lnTo>
-                                      <a:lnTo>
-                                        <a:pt x="6096" y="0"/>
-                                      </a:lnTo>
-                                      <a:lnTo>
-                                        <a:pt x="0" y="0"/>
-                                      </a:lnTo>
-                                      <a:lnTo>
-                                        <a:pt x="0" y="6096"/>
-                                      </a:lnTo>
-                                      <a:lnTo>
-                                        <a:pt x="6096" y="6096"/>
-                                      </a:lnTo>
-                                      <a:lnTo>
-                                        <a:pt x="213360" y="6096"/>
-                                      </a:lnTo>
-                                      <a:lnTo>
-                                        <a:pt x="219456" y="6096"/>
-                                      </a:lnTo>
-                                      <a:lnTo>
-                                        <a:pt x="219456" y="0"/>
-                                      </a:lnTo>
-                                      <a:close/>
-                                    </a:path>
-                                  </a:pathLst>
-                                </a:custGeom>
-                                <a:solidFill>
-                                  <a:srgbClr val="000000"/>
-                                </a:solidFill>
-                              </wps:spPr>
-                              <wps:bodyPr wrap="square" lIns="0" tIns="0" rIns="0" bIns="0" rtlCol="0">
-                                <a:prstTxWarp prst="textNoShape">
-                                  <a:avLst/>
-                                </a:prstTxWarp>
-                                <a:noAutofit/>
-                              </wps:bodyPr>
-                            </wps:wsp>
-                          </wpg:wgp>
-                        </a:graphicData>
-                      </a:graphic>
-                      <wp14:sizeRelV relativeFrom="margin">
-                        <wp14:pctHeight>0</wp14:pctHeight>
-                      </wp14:sizeRelV>
-                    </wp:anchor>
-                  </w:drawing>
-                </mc:Choice>
-                <mc:Fallback>
-                  <w:pict>
-                    <v:group w14:anchorId="346C3EFE" id="Group 1083716320" o:spid="_x0000_s1026" style="position:absolute;margin-left:5.5pt;margin-top:9.1pt;width:17.3pt;height:8.6pt;z-index:-251621888;mso-wrap-distance-left:0;mso-wrap-distance-right:0;mso-height-relative:margin" coordsize="219710,222885" o:gfxdata="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">
-                      <v:shape id="Graphic 6" o:spid="_x0000_s1027" style="position:absolute;width:219710;height:222885;visibility:visible;mso-wrap-style:square;v-text-anchor:top" coordsize="219710,222885" o:gfxdata="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" path="m219456,6108r-6096,l213360,108204r,6096l213360,216408r-207264,l6096,114300r,-6096l6096,6108,,6108,,108204r,6096l,216408r,6096l6096,222504r207264,l219456,222504r,-6096l219456,114300r,-6096l219456,6108xem219456,r-6096,l6096,,,,,6096r6096,l213360,6096r6096,l219456,xe" fillcolor="black" stroked="f">
-                        <v:path arrowok="t"/>
-                      </v:shape>
-                    </v:group>
-                  </w:pict>
-                </mc:Fallback>
-              </mc:AlternateContent>
-            </w:r>
-            <w:r>
-              <w:rPr>
-                <w:noProof/>
-                <w:sz w:val="14"/>
-              </w:rPr>
-              <mc:AlternateContent>
-                <mc:Choice Requires="wpg">
-                  <w:drawing>
-                    <wp:anchor distT="0" distB="0" distL="0" distR="0" simplePos="0" relativeHeight="251695616" behindDoc="1" locked="0" layoutInCell="1" allowOverlap="1" wp14:anchorId="6FF7932A" wp14:editId="07D5946B">
-                      <wp:simplePos x="0" y="0"/>
-                      <wp:positionH relativeFrom="column">
-                        <wp:posOffset>1968171</wp:posOffset>
-                      </wp:positionH>
-                      <wp:positionV relativeFrom="paragraph">
-                        <wp:posOffset>119461</wp:posOffset>
-                      </wp:positionV>
-                      <wp:extent cx="204470" cy="123863"/>
-                      <wp:effectExtent l="0" t="0" r="5080" b="9525"/>
-                      <wp:wrapNone/>
-                      <wp:docPr id="1781782550" name="Group 1781782550"/>
-                      <wp:cNvGraphicFramePr>
-                        <a:graphicFrameLocks xmlns:a="http://schemas.openxmlformats.org/drawingml/2006/main"/>
-                      </wp:cNvGraphicFramePr>
-                      <a:graphic xmlns:a="http://schemas.openxmlformats.org/drawingml/2006/main">
-                        <a:graphicData uri="http://schemas.microsoft.com/office/word/2010/wordprocessingGroup">
-                          <wpg:wgp>
-                            <wpg:cNvGrpSpPr>
-                              <a:grpSpLocks/>
-                            </wpg:cNvGrpSpPr>
-                            <wpg:grpSpPr>
-                              <a:xfrm>
-                                <a:off x="0" y="0"/>
-                                <a:ext cx="204470" cy="123863"/>
-                                <a:chOff x="0" y="0"/>
-                                <a:chExt cx="204470" cy="222885"/>
-                              </a:xfrm>
-                            </wpg:grpSpPr>
-                            <wps:wsp>
-                              <wps:cNvPr id="88431945" name="Graphic 8"/>
-                              <wps:cNvSpPr/>
-                              <wps:spPr>
-                                <a:xfrm>
-                                  <a:off x="0" y="0"/>
-                                  <a:ext cx="204470" cy="222885"/>
-                                </a:xfrm>
-                                <a:custGeom>
-                                  <a:avLst/>
-                                  <a:gdLst/>
-                                  <a:ahLst/>
-                                  <a:cxnLst/>
-                                  <a:rect l="l" t="t" r="r" b="b"/>
-                                  <a:pathLst>
-                                    <a:path w="204470" h="222885">
-                                      <a:moveTo>
-                                        <a:pt x="204216" y="6108"/>
-                                      </a:moveTo>
-                                      <a:lnTo>
-                                        <a:pt x="198120" y="6108"/>
-                                      </a:lnTo>
-                                      <a:lnTo>
-                                        <a:pt x="198120" y="108204"/>
-                                      </a:lnTo>
-                                      <a:lnTo>
-                                        <a:pt x="198120" y="114300"/>
-                                      </a:lnTo>
-                                      <a:lnTo>
-                                        <a:pt x="198120" y="216408"/>
-                                      </a:lnTo>
-                                      <a:lnTo>
-                                        <a:pt x="6096" y="216408"/>
-                                      </a:lnTo>
-                                      <a:lnTo>
-                                        <a:pt x="6096" y="114300"/>
-                                      </a:lnTo>
-                                      <a:lnTo>
-                                        <a:pt x="6096" y="108204"/>
-                                      </a:lnTo>
-                                      <a:lnTo>
-                                        <a:pt x="6096" y="6108"/>
-                                      </a:lnTo>
-                                      <a:lnTo>
-                                        <a:pt x="0" y="6108"/>
-                                      </a:lnTo>
-                                      <a:lnTo>
-                                        <a:pt x="0" y="108204"/>
-                                      </a:lnTo>
-                                      <a:lnTo>
-                                        <a:pt x="0" y="114300"/>
-                                      </a:lnTo>
-                                      <a:lnTo>
-                                        <a:pt x="0" y="216408"/>
-                                      </a:lnTo>
-                                      <a:lnTo>
-                                        <a:pt x="0" y="222504"/>
-                                      </a:lnTo>
-                                      <a:lnTo>
-                                        <a:pt x="6096" y="222504"/>
-                                      </a:lnTo>
-                                      <a:lnTo>
-                                        <a:pt x="198120" y="222504"/>
-                                      </a:lnTo>
-                                      <a:lnTo>
-                                        <a:pt x="204216" y="222504"/>
-                                      </a:lnTo>
-                                      <a:lnTo>
-                                        <a:pt x="204216" y="216408"/>
-                                      </a:lnTo>
-                                      <a:lnTo>
-                                        <a:pt x="204216" y="114300"/>
-                                      </a:lnTo>
-                                      <a:lnTo>
-                                        <a:pt x="204216" y="108204"/>
-                                      </a:lnTo>
-                                      <a:lnTo>
-                                        <a:pt x="204216" y="6108"/>
-                                      </a:lnTo>
-                                      <a:close/>
-                                    </a:path>
-                                    <a:path w="204470" h="222885">
-                                      <a:moveTo>
-                                        <a:pt x="204216" y="0"/>
-                                      </a:moveTo>
-                                      <a:lnTo>
-                                        <a:pt x="198120" y="0"/>
-                                      </a:lnTo>
-                                      <a:lnTo>
-                                        <a:pt x="6096" y="0"/>
-                                      </a:lnTo>
-                                      <a:lnTo>
-                                        <a:pt x="0" y="0"/>
-                                      </a:lnTo>
-                                      <a:lnTo>
-                                        <a:pt x="0" y="6096"/>
-                                      </a:lnTo>
-                                      <a:lnTo>
-                                        <a:pt x="6096" y="6096"/>
-                                      </a:lnTo>
-                                      <a:lnTo>
-                                        <a:pt x="198120" y="6096"/>
-                                      </a:lnTo>
-                                      <a:lnTo>
-                                        <a:pt x="204216" y="6096"/>
-                                      </a:lnTo>
-                                      <a:lnTo>
-                                        <a:pt x="204216" y="0"/>
-                                      </a:lnTo>
-                                      <a:close/>
-                                    </a:path>
-                                  </a:pathLst>
-                                </a:custGeom>
-                                <a:solidFill>
-                                  <a:srgbClr val="000000"/>
-                                </a:solidFill>
-                              </wps:spPr>
-                              <wps:bodyPr wrap="square" lIns="0" tIns="0" rIns="0" bIns="0" rtlCol="0">
-                                <a:prstTxWarp prst="textNoShape">
-                                  <a:avLst/>
-                                </a:prstTxWarp>
-                                <a:noAutofit/>
-                              </wps:bodyPr>
-                            </wps:wsp>
-                          </wpg:wgp>
-                        </a:graphicData>
-                      </a:graphic>
-                      <wp14:sizeRelV relativeFrom="margin">
-                        <wp14:pctHeight>0</wp14:pctHeight>
-                      </wp14:sizeRelV>
-                    </wp:anchor>
-                  </w:drawing>
-                </mc:Choice>
-                <mc:Fallback>
-                  <w:pict>
-                    <v:group w14:anchorId="41EE70D4" id="Group 1781782550" o:spid="_x0000_s1026" style="position:absolute;margin-left:154.95pt;margin-top:9.4pt;width:16.1pt;height:9.75pt;z-index:-251620864;mso-wrap-distance-left:0;mso-wrap-distance-right:0;mso-height-relative:margin" coordsize="204470,222885" o:gfxdata="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">
-                      <v:shape id="Graphic 8" o:spid="_x0000_s1027" style="position:absolute;width:204470;height:222885;visibility:visible;mso-wrap-style:square;v-text-anchor:top" coordsize="204470,222885" o:gfxdata="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" path="m204216,6108r-6096,l198120,108204r,6096l198120,216408r-192024,l6096,114300r,-6096l6096,6108,,6108,,108204r,6096l,216408r,6096l6096,222504r192024,l204216,222504r,-6096l204216,114300r,-6096l204216,6108xem204216,r-6096,l6096,,,,,6096r6096,l198120,6096r6096,l204216,xe" fillcolor="black" stroked="f">
-                        <v:path arrowok="t"/>
-                      </v:shape>
-                    </v:group>
-                  </w:pict>
-                </mc:Fallback>
-              </mc:AlternateContent>
-            </w:r>
-            <w:r>
-              <w:rPr>
-                <w:noProof/>
-                <w:sz w:val="14"/>
-              </w:rPr>
-              <mc:AlternateContent>
-                <mc:Choice Requires="wpg">
-                  <w:drawing>
-                    <wp:anchor distT="0" distB="0" distL="0" distR="0" simplePos="0" relativeHeight="251696640" behindDoc="1" locked="0" layoutInCell="1" allowOverlap="1" wp14:anchorId="27AB7E8D" wp14:editId="7922AB1B">
-                      <wp:simplePos x="0" y="0"/>
-                      <wp:positionH relativeFrom="column">
-                        <wp:posOffset>3412259</wp:posOffset>
-                      </wp:positionH>
-                      <wp:positionV relativeFrom="paragraph">
-                        <wp:posOffset>117764</wp:posOffset>
-                      </wp:positionV>
-                      <wp:extent cx="231775" cy="135081"/>
-                      <wp:effectExtent l="0" t="0" r="0" b="0"/>
-                      <wp:wrapNone/>
-                      <wp:docPr id="829913159" name="Group 829913159"/>
-                      <wp:cNvGraphicFramePr>
-                        <a:graphicFrameLocks xmlns:a="http://schemas.openxmlformats.org/drawingml/2006/main"/>
-                      </wp:cNvGraphicFramePr>
-                      <a:graphic xmlns:a="http://schemas.openxmlformats.org/drawingml/2006/main">
-                        <a:graphicData uri="http://schemas.microsoft.com/office/word/2010/wordprocessingGroup">
-                          <wpg:wgp>
-                            <wpg:cNvGrpSpPr>
-                              <a:grpSpLocks/>
-                            </wpg:cNvGrpSpPr>
-                            <wpg:grpSpPr>
-                              <a:xfrm>
-                                <a:off x="0" y="0"/>
-                                <a:ext cx="231775" cy="135081"/>
-                                <a:chOff x="0" y="0"/>
-                                <a:chExt cx="231775" cy="222885"/>
-                              </a:xfrm>
-                            </wpg:grpSpPr>
-                            <wps:wsp>
-                              <wps:cNvPr id="154128789" name="Graphic 10"/>
-                              <wps:cNvSpPr/>
-                              <wps:spPr>
-                                <a:xfrm>
-                                  <a:off x="0" y="0"/>
-                                  <a:ext cx="231775" cy="222885"/>
-                                </a:xfrm>
-                                <a:custGeom>
-                                  <a:avLst/>
-                                  <a:gdLst/>
-                                  <a:ahLst/>
-                                  <a:cxnLst/>
-                                  <a:rect l="l" t="t" r="r" b="b"/>
-                                  <a:pathLst>
-                                    <a:path w="231775" h="222885">
-                                      <a:moveTo>
-                                        <a:pt x="6083" y="6108"/>
-                                      </a:moveTo>
-                                      <a:lnTo>
-                                        <a:pt x="0" y="6108"/>
-                                      </a:lnTo>
-                                      <a:lnTo>
-                                        <a:pt x="0" y="108204"/>
-                                      </a:lnTo>
-                                      <a:lnTo>
-                                        <a:pt x="0" y="114300"/>
-                                      </a:lnTo>
-                                      <a:lnTo>
-                                        <a:pt x="0" y="216408"/>
-                                      </a:lnTo>
-                                      <a:lnTo>
-                                        <a:pt x="0" y="222504"/>
-                                      </a:lnTo>
-                                      <a:lnTo>
-                                        <a:pt x="6083" y="222504"/>
-                                      </a:lnTo>
-                                      <a:lnTo>
-                                        <a:pt x="6083" y="216408"/>
-                                      </a:lnTo>
-                                      <a:lnTo>
-                                        <a:pt x="6083" y="114300"/>
-                                      </a:lnTo>
-                                      <a:lnTo>
-                                        <a:pt x="6083" y="108204"/>
-                                      </a:lnTo>
-                                      <a:lnTo>
-                                        <a:pt x="6083" y="6108"/>
-                                      </a:lnTo>
-                                      <a:close/>
-                                    </a:path>
-                                    <a:path w="231775" h="222885">
-                                      <a:moveTo>
-                                        <a:pt x="6083" y="0"/>
-                                      </a:moveTo>
-                                      <a:lnTo>
-                                        <a:pt x="0" y="0"/>
-                                      </a:lnTo>
-                                      <a:lnTo>
-                                        <a:pt x="0" y="6096"/>
-                                      </a:lnTo>
-                                      <a:lnTo>
-                                        <a:pt x="6083" y="6096"/>
-                                      </a:lnTo>
-                                      <a:lnTo>
-                                        <a:pt x="6083" y="0"/>
-                                      </a:lnTo>
-                                      <a:close/>
-                                    </a:path>
-                                    <a:path w="231775" h="222885">
-                                      <a:moveTo>
-                                        <a:pt x="231648" y="6108"/>
-                                      </a:moveTo>
-                                      <a:lnTo>
-                                        <a:pt x="225552" y="6108"/>
-                                      </a:lnTo>
-                                      <a:lnTo>
-                                        <a:pt x="225552" y="108204"/>
-                                      </a:lnTo>
-                                      <a:lnTo>
-                                        <a:pt x="225552" y="114300"/>
-                                      </a:lnTo>
-                                      <a:lnTo>
-                                        <a:pt x="225552" y="216408"/>
-                                      </a:lnTo>
-                                      <a:lnTo>
-                                        <a:pt x="6096" y="216408"/>
-                                      </a:lnTo>
-                                      <a:lnTo>
-                                        <a:pt x="6096" y="222504"/>
-                                      </a:lnTo>
-                                      <a:lnTo>
-                                        <a:pt x="225552" y="222504"/>
-                                      </a:lnTo>
-                                      <a:lnTo>
-                                        <a:pt x="231648" y="222504"/>
-                                      </a:lnTo>
-                                      <a:lnTo>
-                                        <a:pt x="231648" y="216408"/>
-                                      </a:lnTo>
-                                      <a:lnTo>
-                                        <a:pt x="231648" y="114300"/>
-                                      </a:lnTo>
-                                      <a:lnTo>
-                                        <a:pt x="231648" y="108204"/>
-                                      </a:lnTo>
-                                      <a:lnTo>
-                                        <a:pt x="231648" y="6108"/>
-                                      </a:lnTo>
-                                      <a:close/>
-                                    </a:path>
-                                    <a:path w="231775" h="222885">
-                                      <a:moveTo>
-                                        <a:pt x="231648" y="0"/>
-                                      </a:moveTo>
-                                      <a:lnTo>
-                                        <a:pt x="225552" y="0"/>
-                                      </a:lnTo>
-                                      <a:lnTo>
-                                        <a:pt x="6096" y="0"/>
-                                      </a:lnTo>
-                                      <a:lnTo>
-                                        <a:pt x="6096" y="6096"/>
-                                      </a:lnTo>
-                                      <a:lnTo>
-                                        <a:pt x="225552" y="6096"/>
-                                      </a:lnTo>
-                                      <a:lnTo>
-                                        <a:pt x="231648" y="6096"/>
-                                      </a:lnTo>
-                                      <a:lnTo>
-                                        <a:pt x="231648" y="0"/>
-                                      </a:lnTo>
-                                      <a:close/>
-                                    </a:path>
-                                  </a:pathLst>
-                                </a:custGeom>
-                                <a:solidFill>
-                                  <a:srgbClr val="000000"/>
-                                </a:solidFill>
-                              </wps:spPr>
-                              <wps:bodyPr wrap="square" lIns="0" tIns="0" rIns="0" bIns="0" rtlCol="0">
-                                <a:prstTxWarp prst="textNoShape">
-                                  <a:avLst/>
-                                </a:prstTxWarp>
-                                <a:noAutofit/>
-                              </wps:bodyPr>
-                            </wps:wsp>
-                          </wpg:wgp>
-                        </a:graphicData>
-                      </a:graphic>
-                      <wp14:sizeRelV relativeFrom="margin">
-                        <wp14:pctHeight>0</wp14:pctHeight>
-                      </wp14:sizeRelV>
-                    </wp:anchor>
-                  </w:drawing>
-                </mc:Choice>
-                <mc:Fallback>
-                  <w:pict>
-                    <v:group w14:anchorId="08188F8F" id="Group 829913159" o:spid="_x0000_s1026" style="position:absolute;margin-left:268.7pt;margin-top:9.25pt;width:18.25pt;height:10.65pt;z-index:-251619840;mso-wrap-distance-left:0;mso-wrap-distance-right:0;mso-height-relative:margin" coordsize="231775,222885" o:gfxdata="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">
-                      <v:shape id="Graphic 10" o:spid="_x0000_s1027" style="position:absolute;width:231775;height:222885;visibility:visible;mso-wrap-style:square;v-text-anchor:top" coordsize="231775,222885" o:gfxdata="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" path="m6083,6108l,6108,,108204r,6096l,216408r,6096l6083,222504r,-6096l6083,114300r,-6096l6083,6108xem6083,l,,,6096r6083,l6083,xem231648,6108r-6096,l225552,108204r,6096l225552,216408r-219456,l6096,222504r219456,l231648,222504r,-6096l231648,114300r,-6096l231648,6108xem231648,r-6096,l6096,r,6096l225552,6096r6096,l231648,xe" fillcolor="black" stroked="f">
-                        <v:path arrowok="t"/>
-                      </v:shape>
-                    </v:group>
-                  </w:pict>
-                </mc:Fallback>
-              </mc:AlternateContent>
-            </w:r>
             <w:r>
               <w:rPr>
                 <w:i/>
@@ -3916,214 +2072,6 @@
             </w:pPr>
             <w:r>
               <w:rPr>
-                <w:noProof/>
-                <w:sz w:val="14"/>
-              </w:rPr>
-              <mc:AlternateContent>
-                <mc:Choice Requires="wpg">
-                  <w:drawing>
-                    <wp:anchor distT="0" distB="0" distL="0" distR="0" simplePos="0" relativeHeight="251698688" behindDoc="1" locked="0" layoutInCell="1" allowOverlap="1" wp14:anchorId="420B1A61" wp14:editId="3EFFC08C">
-                      <wp:simplePos x="0" y="0"/>
-                      <wp:positionH relativeFrom="column">
-                        <wp:posOffset>82082</wp:posOffset>
-                      </wp:positionH>
-                      <wp:positionV relativeFrom="paragraph">
-                        <wp:posOffset>107315</wp:posOffset>
-                      </wp:positionV>
-                      <wp:extent cx="200025" cy="127000"/>
-                      <wp:effectExtent l="0" t="0" r="9525" b="6350"/>
-                      <wp:wrapNone/>
-                      <wp:docPr id="609476441" name="Group 609476441"/>
-                      <wp:cNvGraphicFramePr>
-                        <a:graphicFrameLocks xmlns:a="http://schemas.openxmlformats.org/drawingml/2006/main"/>
-                      </wp:cNvGraphicFramePr>
-                      <a:graphic xmlns:a="http://schemas.openxmlformats.org/drawingml/2006/main">
-                        <a:graphicData uri="http://schemas.microsoft.com/office/word/2010/wordprocessingGroup">
-                          <wpg:wgp>
-                            <wpg:cNvGrpSpPr>
-                              <a:grpSpLocks/>
-                            </wpg:cNvGrpSpPr>
-                            <wpg:grpSpPr>
-                              <a:xfrm>
-                                <a:off x="0" y="0"/>
-                                <a:ext cx="200025" cy="127000"/>
-                                <a:chOff x="0" y="0"/>
-                                <a:chExt cx="180340" cy="222885"/>
-                              </a:xfrm>
-                            </wpg:grpSpPr>
-                            <wps:wsp>
-                              <wps:cNvPr id="1905632678" name="Graphic 12"/>
-                              <wps:cNvSpPr/>
-                              <wps:spPr>
-                                <a:xfrm>
-                                  <a:off x="0" y="0"/>
-                                  <a:ext cx="180340" cy="222885"/>
-                                </a:xfrm>
-                                <a:custGeom>
-                                  <a:avLst/>
-                                  <a:gdLst/>
-                                  <a:ahLst/>
-                                  <a:cxnLst/>
-                                  <a:rect l="l" t="t" r="r" b="b"/>
-                                  <a:pathLst>
-                                    <a:path w="180340" h="222885">
-                                      <a:moveTo>
-                                        <a:pt x="174040" y="216408"/>
-                                      </a:moveTo>
-                                      <a:lnTo>
-                                        <a:pt x="6096" y="216408"/>
-                                      </a:lnTo>
-                                      <a:lnTo>
-                                        <a:pt x="6096" y="114300"/>
-                                      </a:lnTo>
-                                      <a:lnTo>
-                                        <a:pt x="6096" y="108204"/>
-                                      </a:lnTo>
-                                      <a:lnTo>
-                                        <a:pt x="6096" y="6108"/>
-                                      </a:lnTo>
-                                      <a:lnTo>
-                                        <a:pt x="0" y="6108"/>
-                                      </a:lnTo>
-                                      <a:lnTo>
-                                        <a:pt x="0" y="108204"/>
-                                      </a:lnTo>
-                                      <a:lnTo>
-                                        <a:pt x="0" y="114300"/>
-                                      </a:lnTo>
-                                      <a:lnTo>
-                                        <a:pt x="0" y="216408"/>
-                                      </a:lnTo>
-                                      <a:lnTo>
-                                        <a:pt x="0" y="222504"/>
-                                      </a:lnTo>
-                                      <a:lnTo>
-                                        <a:pt x="6096" y="222504"/>
-                                      </a:lnTo>
-                                      <a:lnTo>
-                                        <a:pt x="174040" y="222504"/>
-                                      </a:lnTo>
-                                      <a:lnTo>
-                                        <a:pt x="174040" y="216408"/>
-                                      </a:lnTo>
-                                      <a:close/>
-                                    </a:path>
-                                    <a:path w="180340" h="222885">
-                                      <a:moveTo>
-                                        <a:pt x="174040" y="0"/>
-                                      </a:moveTo>
-                                      <a:lnTo>
-                                        <a:pt x="6096" y="0"/>
-                                      </a:lnTo>
-                                      <a:lnTo>
-                                        <a:pt x="0" y="0"/>
-                                      </a:lnTo>
-                                      <a:lnTo>
-                                        <a:pt x="0" y="6096"/>
-                                      </a:lnTo>
-                                      <a:lnTo>
-                                        <a:pt x="6096" y="6096"/>
-                                      </a:lnTo>
-                                      <a:lnTo>
-                                        <a:pt x="174040" y="6096"/>
-                                      </a:lnTo>
-                                      <a:lnTo>
-                                        <a:pt x="174040" y="0"/>
-                                      </a:lnTo>
-                                      <a:close/>
-                                    </a:path>
-                                    <a:path w="180340" h="222885">
-                                      <a:moveTo>
-                                        <a:pt x="180213" y="6108"/>
-                                      </a:moveTo>
-                                      <a:lnTo>
-                                        <a:pt x="174117" y="6108"/>
-                                      </a:lnTo>
-                                      <a:lnTo>
-                                        <a:pt x="174117" y="108204"/>
-                                      </a:lnTo>
-                                      <a:lnTo>
-                                        <a:pt x="174117" y="114300"/>
-                                      </a:lnTo>
-                                      <a:lnTo>
-                                        <a:pt x="174117" y="216408"/>
-                                      </a:lnTo>
-                                      <a:lnTo>
-                                        <a:pt x="174117" y="222504"/>
-                                      </a:lnTo>
-                                      <a:lnTo>
-                                        <a:pt x="180213" y="222504"/>
-                                      </a:lnTo>
-                                      <a:lnTo>
-                                        <a:pt x="180213" y="216408"/>
-                                      </a:lnTo>
-                                      <a:lnTo>
-                                        <a:pt x="180213" y="114300"/>
-                                      </a:lnTo>
-                                      <a:lnTo>
-                                        <a:pt x="180213" y="108204"/>
-                                      </a:lnTo>
-                                      <a:lnTo>
-                                        <a:pt x="180213" y="6108"/>
-                                      </a:lnTo>
-                                      <a:close/>
-                                    </a:path>
-                                    <a:path w="180340" h="222885">
-                                      <a:moveTo>
-                                        <a:pt x="180213" y="0"/>
-                                      </a:moveTo>
-                                      <a:lnTo>
-                                        <a:pt x="174117" y="0"/>
-                                      </a:lnTo>
-                                      <a:lnTo>
-                                        <a:pt x="174117" y="6096"/>
-                                      </a:lnTo>
-                                      <a:lnTo>
-                                        <a:pt x="180213" y="6096"/>
-                                      </a:lnTo>
-                                      <a:lnTo>
-                                        <a:pt x="180213" y="0"/>
-                                      </a:lnTo>
-                                      <a:close/>
-                                    </a:path>
-                                  </a:pathLst>
-                                </a:custGeom>
-                                <a:solidFill>
-                                  <a:srgbClr val="000000"/>
-                                </a:solidFill>
-                              </wps:spPr>
-                              <wps:bodyPr wrap="square" lIns="0" tIns="0" rIns="0" bIns="0" rtlCol="0">
-                                <a:prstTxWarp prst="textNoShape">
-                                  <a:avLst/>
-                                </a:prstTxWarp>
-                                <a:noAutofit/>
-                              </wps:bodyPr>
-                            </wps:wsp>
-                          </wpg:wgp>
-                        </a:graphicData>
-                      </a:graphic>
-                      <wp14:sizeRelH relativeFrom="margin">
-                        <wp14:pctWidth>0</wp14:pctWidth>
-                      </wp14:sizeRelH>
-                      <wp14:sizeRelV relativeFrom="margin">
-                        <wp14:pctHeight>0</wp14:pctHeight>
-                      </wp14:sizeRelV>
-                    </wp:anchor>
-                  </w:drawing>
-                </mc:Choice>
-                <mc:Fallback>
-                  <w:pict>
-                    <v:group w14:anchorId="2F6D0EDE" id="Group 609476441" o:spid="_x0000_s1026" style="position:absolute;margin-left:6.45pt;margin-top:8.45pt;width:15.75pt;height:10pt;z-index:-251617792;mso-wrap-distance-left:0;mso-wrap-distance-right:0;mso-width-relative:margin;mso-height-relative:margin" coordsize="180340,222885" o:gfxdata="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">
-                      <v:shape id="Graphic 12" o:spid="_x0000_s1027" style="position:absolute;width:180340;height:222885;visibility:visible;mso-wrap-style:square;v-text-anchor:top" coordsize="180340,222885" o:gfxdata="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" path="m174040,216408r-167944,l6096,114300r,-6096l6096,6108,,6108,,108204r,6096l,216408r,6096l6096,222504r167944,l174040,216408xem174040,l6096,,,,,6096r6096,l174040,6096r,-6096xem180213,6108r-6096,l174117,108204r,6096l174117,216408r,6096l180213,222504r,-6096l180213,114300r,-6096l180213,6108xem180213,r-6096,l174117,6096r6096,l180213,xe" fillcolor="black" stroked="f">
-                        <v:path arrowok="t"/>
-                      </v:shape>
-                    </v:group>
-                  </w:pict>
-                </mc:Fallback>
-              </mc:AlternateContent>
-            </w:r>
-            <w:r>
-              <w:rPr>
                 <w:sz w:val="14"/>
               </w:rPr>
               <w:t>Planning</w:t>
@@ -4170,214 +2118,6 @@
                 <w:lang w:val="en-MY"/>
               </w:rPr>
             </w:pPr>
-            <w:r>
-              <w:rPr>
-                <w:noProof/>
-                <w:sz w:val="14"/>
-              </w:rPr>
-              <mc:AlternateContent>
-                <mc:Choice Requires="wpg">
-                  <w:drawing>
-                    <wp:anchor distT="0" distB="0" distL="0" distR="0" simplePos="0" relativeHeight="251697664" behindDoc="1" locked="0" layoutInCell="1" allowOverlap="1" wp14:anchorId="748A955F" wp14:editId="0391478A">
-                      <wp:simplePos x="0" y="0"/>
-                      <wp:positionH relativeFrom="column">
-                        <wp:posOffset>1971207</wp:posOffset>
-                      </wp:positionH>
-                      <wp:positionV relativeFrom="paragraph">
-                        <wp:posOffset>10795</wp:posOffset>
-                      </wp:positionV>
-                      <wp:extent cx="200367" cy="127506"/>
-                      <wp:effectExtent l="0" t="0" r="9525" b="6350"/>
-                      <wp:wrapNone/>
-                      <wp:docPr id="1978953911" name="Group 1978953911"/>
-                      <wp:cNvGraphicFramePr>
-                        <a:graphicFrameLocks xmlns:a="http://schemas.openxmlformats.org/drawingml/2006/main"/>
-                      </wp:cNvGraphicFramePr>
-                      <a:graphic xmlns:a="http://schemas.openxmlformats.org/drawingml/2006/main">
-                        <a:graphicData uri="http://schemas.microsoft.com/office/word/2010/wordprocessingGroup">
-                          <wpg:wgp>
-                            <wpg:cNvGrpSpPr>
-                              <a:grpSpLocks/>
-                            </wpg:cNvGrpSpPr>
-                            <wpg:grpSpPr>
-                              <a:xfrm>
-                                <a:off x="0" y="0"/>
-                                <a:ext cx="200367" cy="127506"/>
-                                <a:chOff x="0" y="0"/>
-                                <a:chExt cx="180340" cy="222885"/>
-                              </a:xfrm>
-                            </wpg:grpSpPr>
-                            <wps:wsp>
-                              <wps:cNvPr id="1831423836" name="Graphic 12"/>
-                              <wps:cNvSpPr/>
-                              <wps:spPr>
-                                <a:xfrm>
-                                  <a:off x="0" y="0"/>
-                                  <a:ext cx="180340" cy="222885"/>
-                                </a:xfrm>
-                                <a:custGeom>
-                                  <a:avLst/>
-                                  <a:gdLst/>
-                                  <a:ahLst/>
-                                  <a:cxnLst/>
-                                  <a:rect l="l" t="t" r="r" b="b"/>
-                                  <a:pathLst>
-                                    <a:path w="180340" h="222885">
-                                      <a:moveTo>
-                                        <a:pt x="174040" y="216408"/>
-                                      </a:moveTo>
-                                      <a:lnTo>
-                                        <a:pt x="6096" y="216408"/>
-                                      </a:lnTo>
-                                      <a:lnTo>
-                                        <a:pt x="6096" y="114300"/>
-                                      </a:lnTo>
-                                      <a:lnTo>
-                                        <a:pt x="6096" y="108204"/>
-                                      </a:lnTo>
-                                      <a:lnTo>
-                                        <a:pt x="6096" y="6108"/>
-                                      </a:lnTo>
-                                      <a:lnTo>
-                                        <a:pt x="0" y="6108"/>
-                                      </a:lnTo>
-                                      <a:lnTo>
-                                        <a:pt x="0" y="108204"/>
-                                      </a:lnTo>
-                                      <a:lnTo>
-                                        <a:pt x="0" y="114300"/>
-                                      </a:lnTo>
-                                      <a:lnTo>
-                                        <a:pt x="0" y="216408"/>
-                                      </a:lnTo>
-                                      <a:lnTo>
-                                        <a:pt x="0" y="222504"/>
-                                      </a:lnTo>
-                                      <a:lnTo>
-                                        <a:pt x="6096" y="222504"/>
-                                      </a:lnTo>
-                                      <a:lnTo>
-                                        <a:pt x="174040" y="222504"/>
-                                      </a:lnTo>
-                                      <a:lnTo>
-                                        <a:pt x="174040" y="216408"/>
-                                      </a:lnTo>
-                                      <a:close/>
-                                    </a:path>
-                                    <a:path w="180340" h="222885">
-                                      <a:moveTo>
-                                        <a:pt x="174040" y="0"/>
-                                      </a:moveTo>
-                                      <a:lnTo>
-                                        <a:pt x="6096" y="0"/>
-                                      </a:lnTo>
-                                      <a:lnTo>
-                                        <a:pt x="0" y="0"/>
-                                      </a:lnTo>
-                                      <a:lnTo>
-                                        <a:pt x="0" y="6096"/>
-                                      </a:lnTo>
-                                      <a:lnTo>
-                                        <a:pt x="6096" y="6096"/>
-                                      </a:lnTo>
-                                      <a:lnTo>
-                                        <a:pt x="174040" y="6096"/>
-                                      </a:lnTo>
-                                      <a:lnTo>
-                                        <a:pt x="174040" y="0"/>
-                                      </a:lnTo>
-                                      <a:close/>
-                                    </a:path>
-                                    <a:path w="180340" h="222885">
-                                      <a:moveTo>
-                                        <a:pt x="180213" y="6108"/>
-                                      </a:moveTo>
-                                      <a:lnTo>
-                                        <a:pt x="174117" y="6108"/>
-                                      </a:lnTo>
-                                      <a:lnTo>
-                                        <a:pt x="174117" y="108204"/>
-                                      </a:lnTo>
-                                      <a:lnTo>
-                                        <a:pt x="174117" y="114300"/>
-                                      </a:lnTo>
-                                      <a:lnTo>
-                                        <a:pt x="174117" y="216408"/>
-                                      </a:lnTo>
-                                      <a:lnTo>
-                                        <a:pt x="174117" y="222504"/>
-                                      </a:lnTo>
-                                      <a:lnTo>
-                                        <a:pt x="180213" y="222504"/>
-                                      </a:lnTo>
-                                      <a:lnTo>
-                                        <a:pt x="180213" y="216408"/>
-                                      </a:lnTo>
-                                      <a:lnTo>
-                                        <a:pt x="180213" y="114300"/>
-                                      </a:lnTo>
-                                      <a:lnTo>
-                                        <a:pt x="180213" y="108204"/>
-                                      </a:lnTo>
-                                      <a:lnTo>
-                                        <a:pt x="180213" y="6108"/>
-                                      </a:lnTo>
-                                      <a:close/>
-                                    </a:path>
-                                    <a:path w="180340" h="222885">
-                                      <a:moveTo>
-                                        <a:pt x="180213" y="0"/>
-                                      </a:moveTo>
-                                      <a:lnTo>
-                                        <a:pt x="174117" y="0"/>
-                                      </a:lnTo>
-                                      <a:lnTo>
-                                        <a:pt x="174117" y="6096"/>
-                                      </a:lnTo>
-                                      <a:lnTo>
-                                        <a:pt x="180213" y="6096"/>
-                                      </a:lnTo>
-                                      <a:lnTo>
-                                        <a:pt x="180213" y="0"/>
-                                      </a:lnTo>
-                                      <a:close/>
-                                    </a:path>
-                                  </a:pathLst>
-                                </a:custGeom>
-                                <a:solidFill>
-                                  <a:srgbClr val="000000"/>
-                                </a:solidFill>
-                              </wps:spPr>
-                              <wps:bodyPr wrap="square" lIns="0" tIns="0" rIns="0" bIns="0" rtlCol="0">
-                                <a:prstTxWarp prst="textNoShape">
-                                  <a:avLst/>
-                                </a:prstTxWarp>
-                                <a:noAutofit/>
-                              </wps:bodyPr>
-                            </wps:wsp>
-                          </wpg:wgp>
-                        </a:graphicData>
-                      </a:graphic>
-                      <wp14:sizeRelH relativeFrom="margin">
-                        <wp14:pctWidth>0</wp14:pctWidth>
-                      </wp14:sizeRelH>
-                      <wp14:sizeRelV relativeFrom="margin">
-                        <wp14:pctHeight>0</wp14:pctHeight>
-                      </wp14:sizeRelV>
-                    </wp:anchor>
-                  </w:drawing>
-                </mc:Choice>
-                <mc:Fallback>
-                  <w:pict>
-                    <v:group w14:anchorId="570615EC" id="Group 1978953911" o:spid="_x0000_s1026" style="position:absolute;margin-left:155.2pt;margin-top:.85pt;width:15.8pt;height:10.05pt;z-index:-251618816;mso-wrap-distance-left:0;mso-wrap-distance-right:0;mso-width-relative:margin;mso-height-relative:margin" coordsize="180340,222885" o:gfxdata="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">
-                      <v:shape id="Graphic 12" o:spid="_x0000_s1027" style="position:absolute;width:180340;height:222885;visibility:visible;mso-wrap-style:square;v-text-anchor:top" coordsize="180340,222885" o:gfxdata="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" path="m174040,216408r-167944,l6096,114300r,-6096l6096,6108,,6108,,108204r,6096l,216408r,6096l6096,222504r167944,l174040,216408xem174040,l6096,,,,,6096r6096,l174040,6096r,-6096xem180213,6108r-6096,l174117,108204r,6096l174117,216408r,6096l180213,222504r,-6096l180213,114300r,-6096l180213,6108xem180213,r-6096,l174117,6096r6096,l180213,xe" fillcolor="black" stroked="f">
-                        <v:path arrowok="t"/>
-                      </v:shape>
-                    </v:group>
-                  </w:pict>
-                </mc:Fallback>
-              </mc:AlternateContent>
-            </w:r>
             <w:r>
               <w:rPr>
                 <w:sz w:val="14"/>
@@ -4501,7 +2241,6 @@
         <w:tc>
           <w:tcPr>
             <w:tcW w:w="9026" w:type="dxa"/>
-            <w:gridSpan w:val="6"/>
           </w:tcPr>
           <w:p>
             <w:pPr>
@@ -4521,7 +2260,6 @@
         <w:tc>
           <w:tcPr>
             <w:tcW w:w="9026" w:type="dxa"/>
-            <w:gridSpan w:val="6"/>
           </w:tcPr>
           <w:p>
             <w:pPr>
@@ -4930,7 +2668,6 @@
         <w:tc>
           <w:tcPr>
             <w:tcW w:w="9026" w:type="dxa"/>
-            <w:gridSpan w:val="6"/>
           </w:tcPr>
           <w:p>
             <w:pPr>
@@ -4950,7 +2687,6 @@
         <w:tc>
           <w:tcPr>
             <w:tcW w:w="9026" w:type="dxa"/>
-            <w:gridSpan w:val="6"/>
             <w:tcBorders>
               <w:bottom w:val="nil"/>
             </w:tcBorders>
@@ -5083,11 +2819,11 @@
       </w:tr>
       <w:tr>
         <w:trPr>
-          <w:trHeight w:val="165"/>
+          <w:trHeight w:val="250"/>
         </w:trPr>
         <w:tc>
           <w:tcPr>
-            <w:tcW w:w="113" w:type="dxa"/>
+            <w:tcW w:w="9026" w:type="dxa"/>
             <w:tcBorders>
               <w:top w:val="nil"/>
             </w:tcBorders>
@@ -5100,131 +2836,34 @@
                 <w:sz w:val="10"/>
               </w:rPr>
             </w:pPr>
-          </w:p>
-        </w:tc>
-        <w:tc>
-          <w:tcPr>
-            <w:tcW w:w="238" w:type="dxa"/>
-            <w:tcBorders>
-              <w:bottom w:val="single" w:sz="8" w:space="0" w:color="000000"/>
-            </w:tcBorders>
-          </w:tcPr>
-          <w:p>
-            <w:pPr>
-              <w:pStyle w:val="TableParagraph"/>
+            <w:r>
               <w:rPr>
                 <w:rFonts w:ascii="Times New Roman"/>
-                <w:sz w:val="10"/>
-              </w:rPr>
-            </w:pPr>
-          </w:p>
-        </w:tc>
-        <w:tc>
-          <w:tcPr>
-            <w:tcW w:w="1772" w:type="dxa"/>
-            <w:tcBorders>
-              <w:top w:val="nil"/>
-            </w:tcBorders>
-          </w:tcPr>
-          <w:p>
-            <w:pPr>
-              <w:pStyle w:val="TableParagraph"/>
-              <w:spacing w:line="145" w:lineRule="exact"/>
-              <w:ind w:left="107"/>
-              <w:rPr>
-                <w:sz w:val="14"/>
-              </w:rPr>
-            </w:pPr>
-            <w:r>
-              <w:rPr>
-                <w:sz w:val="14"/>
-              </w:rPr>
-              <w:t>Not</w:t>
-            </w:r>
-            <w:r>
-              <w:rPr>
-                <w:spacing w:val="-4"/>
-                <w:sz w:val="14"/>
-              </w:rPr>
-              <w:t xml:space="preserve"> </w:t>
-            </w:r>
-            <w:r>
-              <w:rPr>
-                <w:spacing w:val="-2"/>
-                <w:sz w:val="14"/>
+                <w:sz w:val="14"/>
+                <w:szCs w:val="28"/>
+              </w:rPr>
+              <w:t xml:space="preserve">                       Not Satisfactory                                        </w:t>
+            </w:r>
+            <w:proofErr w:type="spellStart"/>
+            <w:r>
+              <w:rPr>
+                <w:rFonts w:ascii="Times New Roman"/>
+                <w:sz w:val="14"/>
+                <w:szCs w:val="28"/>
               </w:rPr>
               <w:t>Satisfactory</w:t>
             </w:r>
-          </w:p>
-        </w:tc>
-        <w:tc>
-          <w:tcPr>
-            <w:tcW w:w="273" w:type="dxa"/>
-            <w:tcBorders>
-              <w:bottom w:val="single" w:sz="8" w:space="0" w:color="000000"/>
-            </w:tcBorders>
-          </w:tcPr>
-          <w:p>
-            <w:pPr>
-              <w:pStyle w:val="TableParagraph"/>
-              <w:rPr>
-                <w:rFonts w:ascii="Times New Roman"/>
-                <w:sz w:val="10"/>
-              </w:rPr>
-            </w:pPr>
-          </w:p>
-        </w:tc>
-        <w:tc>
-          <w:tcPr>
-            <w:tcW w:w="3525" w:type="dxa"/>
-            <w:tcBorders>
-              <w:top w:val="nil"/>
-            </w:tcBorders>
-          </w:tcPr>
-          <w:p>
-            <w:pPr>
-              <w:pStyle w:val="TableParagraph"/>
-              <w:spacing w:line="145" w:lineRule="exact"/>
-              <w:ind w:left="105"/>
-              <w:rPr>
-                <w:sz w:val="14"/>
-              </w:rPr>
-            </w:pPr>
-            <w:r>
-              <w:rPr>
-                <w:spacing w:val="-2"/>
-                <w:sz w:val="14"/>
-              </w:rPr>
-              <w:t>Satisfactory</w:t>
-            </w:r>
-          </w:p>
-        </w:tc>
-        <w:tc>
-          <w:tcPr>
-            <w:tcW w:w="3105" w:type="dxa"/>
-            <w:tcBorders>
-              <w:top w:val="nil"/>
-            </w:tcBorders>
-          </w:tcPr>
-          <w:p>
-            <w:pPr>
-              <w:pStyle w:val="TableParagraph"/>
-              <w:rPr>
-                <w:rFonts w:ascii="Times New Roman"/>
-                <w:sz w:val="10"/>
-              </w:rPr>
-            </w:pPr>
+            <w:proofErr w:type="spellEnd"/>
           </w:p>
         </w:tc>
       </w:tr>
       <w:tr>
         <w:trPr>
-          <w:trHeight w:val="916"/>
+          <w:trHeight w:val="487"/>
         </w:trPr>
         <w:tc>
           <w:tcPr>
             <w:tcW w:w="9026" w:type="dxa"/>
-            <w:gridSpan w:val="6"/>
             <w:tcBorders>
               <w:top w:val="single" w:sz="8" w:space="0" w:color="000000"/>
             </w:tcBorders>
@@ -5618,11 +3257,19 @@
                 <w:sz w:val="14"/>
               </w:rPr>
             </w:pPr>
-            <w:r>
-              <w:rPr>
-                <w:sz w:val="14"/>
-              </w:rPr>
-              <w:t>Student must upload the soft copies of the meeting logs and attach</w:t>
+            <w:proofErr w:type="gramStart"/>
+            <w:r>
+              <w:rPr>
+                <w:sz w:val="14"/>
+              </w:rPr>
+              <w:t>Student</w:t>
+            </w:r>
+            <w:proofErr w:type="gramEnd"/>
+            <w:r>
+              <w:rPr>
+                <w:sz w:val="14"/>
+              </w:rPr>
+              <w:t xml:space="preserve"> must upload the soft copies of the meeting logs and attach</w:t>
             </w:r>
             <w:r>
               <w:rPr>
@@ -6276,11 +3923,19 @@
                 <w:sz w:val="14"/>
               </w:rPr>
             </w:pPr>
-            <w:r>
-              <w:rPr>
-                <w:sz w:val="14"/>
-              </w:rPr>
-              <w:t>Student who fails to meet the minimum requirement (six nos.) of log</w:t>
+            <w:proofErr w:type="gramStart"/>
+            <w:r>
+              <w:rPr>
+                <w:sz w:val="14"/>
+              </w:rPr>
+              <w:t>Student</w:t>
+            </w:r>
+            <w:proofErr w:type="gramEnd"/>
+            <w:r>
+              <w:rPr>
+                <w:sz w:val="14"/>
+              </w:rPr>
+              <w:t xml:space="preserve"> who fails to meet the minimum requirement (six nos.) of log</w:t>
             </w:r>
             <w:r>
               <w:rPr>
@@ -7259,6 +4914,7 @@
   <w:style w:type="character" w:default="1" w:styleId="DefaultParagraphFont">
     <w:name w:val="Default Paragraph Font"/>
     <w:uiPriority w:val="1"/>
+    <w:semiHidden/>
     <w:unhideWhenUsed/>
   </w:style>
   <w:style w:type="table" w:default="1" w:styleId="TableNormal">

</xml_diff>